<commit_message>
Docs: Inventory RD v2.1 - accounting and tax item attributes
Item master gains two new attribute groups: Order Management &
Invoicing (orderable/shippable/invoiceable/ATP flags, selling price,
sales UOM, fulfilment tolerances, sales tax code, taxable flag) and
Accounting (sales, sales return, COGS, expense, purchase price
variance and deferred revenue accounts). Purchasing group extends
with purchase tax code, inspection-required flag, invoice match
option and dangerous-goods references. Org assignments add per-org
overrides for the accounts and tax codes, with a documented
resolution order (document line -> org override -> item -> org
parameter). Tax codes reference the existing Re-ERP Tax module.

Co-Authored-By: Claude Fable 5 <noreply@anthropic.com>
Claude-Session: https://claude.ai/code/session_018Wm1aaxafVfzTXSCsiotdW
</commit_message>
<xml_diff>
--- a/docs/design/INV_Module_Requirements_Design.docx
+++ b/docs/design/INV_Module_Requirements_Design.docx
@@ -29,7 +29,7 @@
           <w:sz w:val="22"/>
           <w:szCs w:val="22"/>
         </w:rPr>
-        <w:t xml:space="preserve">Requirements &amp; Design Document (RD) - v2.0 - September 2026</w:t>
+        <w:t xml:space="preserve">Requirements &amp; Design Document (RD) - v2.1 - September 2026</w:t>
       </w:r>
     </w:p>
     <w:p>
@@ -15217,6 +15217,382 @@
           </w:p>
         </w:tc>
       </w:tr>
+      <w:tr>
+        <w:tc>
+          <w:tcPr>
+            <w:tcW w:type="dxa" w:w="2522"/>
+            <w:tcMar>
+              <w:top w:type="dxa" w:w="40"/>
+              <w:left w:type="dxa" w:w="70"/>
+              <w:bottom w:type="dxa" w:w="40"/>
+              <w:right w:type="dxa" w:w="70"/>
+            </w:tcMar>
+          </w:tcPr>
+          <w:p>
+            <w:r>
+              <w:rPr>
+                <w:b w:val="false"/>
+                <w:bCs w:val="false"/>
+                <w:color w:val="1A1A1A"/>
+                <w:sz w:val="16"/>
+                <w:szCs w:val="16"/>
+              </w:rPr>
+              <w:t xml:space="preserve">PURCHASE_TAX_CODE</w:t>
+            </w:r>
+          </w:p>
+        </w:tc>
+        <w:tc>
+          <w:tcPr>
+            <w:tcW w:type="dxa" w:w="1358"/>
+            <w:tcMar>
+              <w:top w:type="dxa" w:w="40"/>
+              <w:left w:type="dxa" w:w="70"/>
+              <w:bottom w:type="dxa" w:w="40"/>
+              <w:right w:type="dxa" w:w="70"/>
+            </w:tcMar>
+          </w:tcPr>
+          <w:p>
+            <w:r>
+              <w:rPr>
+                <w:b w:val="false"/>
+                <w:bCs w:val="false"/>
+                <w:color w:val="1A1A1A"/>
+                <w:sz w:val="16"/>
+                <w:szCs w:val="16"/>
+              </w:rPr>
+              <w:t xml:space="preserve">VARCHAR2(30)</w:t>
+            </w:r>
+          </w:p>
+        </w:tc>
+        <w:tc>
+          <w:tcPr>
+            <w:tcW w:type="dxa" w:w="679"/>
+            <w:tcMar>
+              <w:top w:type="dxa" w:w="40"/>
+              <w:left w:type="dxa" w:w="70"/>
+              <w:bottom w:type="dxa" w:w="40"/>
+              <w:right w:type="dxa" w:w="70"/>
+            </w:tcMar>
+          </w:tcPr>
+          <w:p>
+            <w:r>
+              <w:rPr>
+                <w:b w:val="false"/>
+                <w:bCs w:val="false"/>
+                <w:color w:val="1A1A1A"/>
+                <w:sz w:val="16"/>
+                <w:szCs w:val="16"/>
+              </w:rPr>
+              <w:t xml:space="preserve">N</w:t>
+            </w:r>
+          </w:p>
+        </w:tc>
+        <w:tc>
+          <w:tcPr>
+            <w:tcW w:type="dxa" w:w="5141"/>
+            <w:tcMar>
+              <w:top w:type="dxa" w:w="40"/>
+              <w:left w:type="dxa" w:w="70"/>
+              <w:bottom w:type="dxa" w:w="40"/>
+              <w:right w:type="dxa" w:w="70"/>
+            </w:tcMar>
+          </w:tcPr>
+          <w:p>
+            <w:r>
+              <w:rPr>
+                <w:b w:val="false"/>
+                <w:bCs w:val="false"/>
+                <w:color w:val="1A1A1A"/>
+                <w:sz w:val="16"/>
+                <w:szCs w:val="16"/>
+              </w:rPr>
+              <w:t xml:space="preserve">Input tax classification (existing Tax module codes)</w:t>
+            </w:r>
+          </w:p>
+        </w:tc>
+      </w:tr>
+      <w:tr>
+        <w:tc>
+          <w:tcPr>
+            <w:tcW w:type="dxa" w:w="2522"/>
+            <w:tcMar>
+              <w:top w:type="dxa" w:w="40"/>
+              <w:left w:type="dxa" w:w="70"/>
+              <w:bottom w:type="dxa" w:w="40"/>
+              <w:right w:type="dxa" w:w="70"/>
+            </w:tcMar>
+          </w:tcPr>
+          <w:p>
+            <w:r>
+              <w:rPr>
+                <w:b w:val="false"/>
+                <w:bCs w:val="false"/>
+                <w:color w:val="1A1A1A"/>
+                <w:sz w:val="16"/>
+                <w:szCs w:val="16"/>
+              </w:rPr>
+              <w:t xml:space="preserve">INSPECTION_REQUIRED_FLAG</w:t>
+            </w:r>
+          </w:p>
+        </w:tc>
+        <w:tc>
+          <w:tcPr>
+            <w:tcW w:type="dxa" w:w="1358"/>
+            <w:tcMar>
+              <w:top w:type="dxa" w:w="40"/>
+              <w:left w:type="dxa" w:w="70"/>
+              <w:bottom w:type="dxa" w:w="40"/>
+              <w:right w:type="dxa" w:w="70"/>
+            </w:tcMar>
+          </w:tcPr>
+          <w:p>
+            <w:r>
+              <w:rPr>
+                <w:b w:val="false"/>
+                <w:bCs w:val="false"/>
+                <w:color w:val="1A1A1A"/>
+                <w:sz w:val="16"/>
+                <w:szCs w:val="16"/>
+              </w:rPr>
+              <w:t xml:space="preserve">VARCHAR2(1)</w:t>
+            </w:r>
+          </w:p>
+        </w:tc>
+        <w:tc>
+          <w:tcPr>
+            <w:tcW w:type="dxa" w:w="679"/>
+            <w:tcMar>
+              <w:top w:type="dxa" w:w="40"/>
+              <w:left w:type="dxa" w:w="70"/>
+              <w:bottom w:type="dxa" w:w="40"/>
+              <w:right w:type="dxa" w:w="70"/>
+            </w:tcMar>
+          </w:tcPr>
+          <w:p>
+            <w:r>
+              <w:rPr>
+                <w:b w:val="false"/>
+                <w:bCs w:val="false"/>
+                <w:color w:val="1A1A1A"/>
+                <w:sz w:val="16"/>
+                <w:szCs w:val="16"/>
+              </w:rPr>
+              <w:t xml:space="preserve">Y</w:t>
+            </w:r>
+          </w:p>
+        </w:tc>
+        <w:tc>
+          <w:tcPr>
+            <w:tcW w:type="dxa" w:w="5141"/>
+            <w:tcMar>
+              <w:top w:type="dxa" w:w="40"/>
+              <w:left w:type="dxa" w:w="70"/>
+              <w:bottom w:type="dxa" w:w="40"/>
+              <w:right w:type="dxa" w:w="70"/>
+            </w:tcMar>
+          </w:tcPr>
+          <w:p>
+            <w:r>
+              <w:rPr>
+                <w:b w:val="false"/>
+                <w:bCs w:val="false"/>
+                <w:color w:val="1A1A1A"/>
+                <w:sz w:val="16"/>
+                <w:szCs w:val="16"/>
+              </w:rPr>
+              <w:t xml:space="preserve">Forces INSPECTION routing on receipt (default N)</w:t>
+            </w:r>
+          </w:p>
+        </w:tc>
+      </w:tr>
+      <w:tr>
+        <w:tc>
+          <w:tcPr>
+            <w:tcW w:type="dxa" w:w="2522"/>
+            <w:tcMar>
+              <w:top w:type="dxa" w:w="40"/>
+              <w:left w:type="dxa" w:w="70"/>
+              <w:bottom w:type="dxa" w:w="40"/>
+              <w:right w:type="dxa" w:w="70"/>
+            </w:tcMar>
+          </w:tcPr>
+          <w:p>
+            <w:r>
+              <w:rPr>
+                <w:b w:val="false"/>
+                <w:bCs w:val="false"/>
+                <w:color w:val="1A1A1A"/>
+                <w:sz w:val="16"/>
+                <w:szCs w:val="16"/>
+              </w:rPr>
+              <w:t xml:space="preserve">INVOICE_MATCH_OPTION</w:t>
+            </w:r>
+          </w:p>
+        </w:tc>
+        <w:tc>
+          <w:tcPr>
+            <w:tcW w:type="dxa" w:w="1358"/>
+            <w:tcMar>
+              <w:top w:type="dxa" w:w="40"/>
+              <w:left w:type="dxa" w:w="70"/>
+              <w:bottom w:type="dxa" w:w="40"/>
+              <w:right w:type="dxa" w:w="70"/>
+            </w:tcMar>
+          </w:tcPr>
+          <w:p>
+            <w:r>
+              <w:rPr>
+                <w:b w:val="false"/>
+                <w:bCs w:val="false"/>
+                <w:color w:val="1A1A1A"/>
+                <w:sz w:val="16"/>
+                <w:szCs w:val="16"/>
+              </w:rPr>
+              <w:t xml:space="preserve">VARCHAR2(10)</w:t>
+            </w:r>
+          </w:p>
+        </w:tc>
+        <w:tc>
+          <w:tcPr>
+            <w:tcW w:type="dxa" w:w="679"/>
+            <w:tcMar>
+              <w:top w:type="dxa" w:w="40"/>
+              <w:left w:type="dxa" w:w="70"/>
+              <w:bottom w:type="dxa" w:w="40"/>
+              <w:right w:type="dxa" w:w="70"/>
+            </w:tcMar>
+          </w:tcPr>
+          <w:p>
+            <w:r>
+              <w:rPr>
+                <w:b w:val="false"/>
+                <w:bCs w:val="false"/>
+                <w:color w:val="1A1A1A"/>
+                <w:sz w:val="16"/>
+                <w:szCs w:val="16"/>
+              </w:rPr>
+              <w:t xml:space="preserve">N</w:t>
+            </w:r>
+          </w:p>
+        </w:tc>
+        <w:tc>
+          <w:tcPr>
+            <w:tcW w:type="dxa" w:w="5141"/>
+            <w:tcMar>
+              <w:top w:type="dxa" w:w="40"/>
+              <w:left w:type="dxa" w:w="70"/>
+              <w:bottom w:type="dxa" w:w="40"/>
+              <w:right w:type="dxa" w:w="70"/>
+            </w:tcMar>
+          </w:tcPr>
+          <w:p>
+            <w:r>
+              <w:rPr>
+                <w:b w:val="false"/>
+                <w:bCs w:val="false"/>
+                <w:color w:val="1A1A1A"/>
+                <w:sz w:val="16"/>
+                <w:szCs w:val="16"/>
+              </w:rPr>
+              <w:t xml:space="preserve">2_WAY / 3_WAY - AP matching rule (Phase 2)</w:t>
+            </w:r>
+          </w:p>
+        </w:tc>
+      </w:tr>
+      <w:tr>
+        <w:tc>
+          <w:tcPr>
+            <w:tcW w:type="dxa" w:w="2522"/>
+            <w:tcMar>
+              <w:top w:type="dxa" w:w="40"/>
+              <w:left w:type="dxa" w:w="70"/>
+              <w:bottom w:type="dxa" w:w="40"/>
+              <w:right w:type="dxa" w:w="70"/>
+            </w:tcMar>
+          </w:tcPr>
+          <w:p>
+            <w:r>
+              <w:rPr>
+                <w:b w:val="false"/>
+                <w:bCs w:val="false"/>
+                <w:color w:val="1A1A1A"/>
+                <w:sz w:val="16"/>
+                <w:szCs w:val="16"/>
+              </w:rPr>
+              <w:t xml:space="preserve">UN_NUMBER / HAZARD_CLASS</w:t>
+            </w:r>
+          </w:p>
+        </w:tc>
+        <w:tc>
+          <w:tcPr>
+            <w:tcW w:type="dxa" w:w="1358"/>
+            <w:tcMar>
+              <w:top w:type="dxa" w:w="40"/>
+              <w:left w:type="dxa" w:w="70"/>
+              <w:bottom w:type="dxa" w:w="40"/>
+              <w:right w:type="dxa" w:w="70"/>
+            </w:tcMar>
+          </w:tcPr>
+          <w:p>
+            <w:r>
+              <w:rPr>
+                <w:b w:val="false"/>
+                <w:bCs w:val="false"/>
+                <w:color w:val="1A1A1A"/>
+                <w:sz w:val="16"/>
+                <w:szCs w:val="16"/>
+              </w:rPr>
+              <w:t xml:space="preserve">VARCHAR2(30)</w:t>
+            </w:r>
+          </w:p>
+        </w:tc>
+        <w:tc>
+          <w:tcPr>
+            <w:tcW w:type="dxa" w:w="679"/>
+            <w:tcMar>
+              <w:top w:type="dxa" w:w="40"/>
+              <w:left w:type="dxa" w:w="70"/>
+              <w:bottom w:type="dxa" w:w="40"/>
+              <w:right w:type="dxa" w:w="70"/>
+            </w:tcMar>
+          </w:tcPr>
+          <w:p>
+            <w:r>
+              <w:rPr>
+                <w:b w:val="false"/>
+                <w:bCs w:val="false"/>
+                <w:color w:val="1A1A1A"/>
+                <w:sz w:val="16"/>
+                <w:szCs w:val="16"/>
+              </w:rPr>
+              <w:t xml:space="preserve">N</w:t>
+            </w:r>
+          </w:p>
+        </w:tc>
+        <w:tc>
+          <w:tcPr>
+            <w:tcW w:type="dxa" w:w="5141"/>
+            <w:tcMar>
+              <w:top w:type="dxa" w:w="40"/>
+              <w:left w:type="dxa" w:w="70"/>
+              <w:bottom w:type="dxa" w:w="40"/>
+              <w:right w:type="dxa" w:w="70"/>
+            </w:tcMar>
+          </w:tcPr>
+          <w:p>
+            <w:r>
+              <w:rPr>
+                <w:b w:val="false"/>
+                <w:bCs w:val="false"/>
+                <w:color w:val="1A1A1A"/>
+                <w:sz w:val="16"/>
+                <w:szCs w:val="16"/>
+              </w:rPr>
+              <w:t xml:space="preserve">Dangerous-goods references (informational)</w:t>
+            </w:r>
+          </w:p>
+        </w:tc>
+      </w:tr>
     </w:tbl>
     <w:p>
       <w:pPr>
@@ -15236,7 +15612,7 @@
           <w:sz w:val="21"/>
           <w:szCs w:val="21"/>
         </w:rPr>
-        <w:t xml:space="preserve">Group: Sales &amp; Physical</w:t>
+        <w:t xml:space="preserve">Group: Order Management &amp; Invoicing</w:t>
       </w:r>
     </w:p>
     <w:tbl>
@@ -15447,7 +15823,7 @@
                 <w:sz w:val="16"/>
                 <w:szCs w:val="16"/>
               </w:rPr>
-              <w:t xml:space="preserve">Phase 3 Order Management</w:t>
+              <w:t xml:space="preserve">Item may appear on sales orders (Phase 3)</w:t>
             </w:r>
           </w:p>
         </w:tc>
@@ -15472,7 +15848,7 @@
                 <w:sz w:val="16"/>
                 <w:szCs w:val="16"/>
               </w:rPr>
-              <w:t xml:space="preserve">SELLING_PRICE</w:t>
+              <w:t xml:space="preserve">ORDERABLE_FLAG</w:t>
             </w:r>
           </w:p>
         </w:tc>
@@ -15495,7 +15871,7 @@
                 <w:sz w:val="16"/>
                 <w:szCs w:val="16"/>
               </w:rPr>
-              <w:t xml:space="preserve">NUMBER</w:t>
+              <w:t xml:space="preserve">VARCHAR2(1)</w:t>
             </w:r>
           </w:p>
         </w:tc>
@@ -15518,7 +15894,7 @@
                 <w:sz w:val="16"/>
                 <w:szCs w:val="16"/>
               </w:rPr>
-              <w:t xml:space="preserve">N</w:t>
+              <w:t xml:space="preserve">Y</w:t>
             </w:r>
           </w:p>
         </w:tc>
@@ -15541,7 +15917,7 @@
                 <w:sz w:val="16"/>
                 <w:szCs w:val="16"/>
               </w:rPr>
-              <w:t xml:space="preserve">Default selling price</w:t>
+              <w:t xml:space="preserve">Customer-orderable now vs internal-only (default Y)</w:t>
             </w:r>
           </w:p>
         </w:tc>
@@ -15566,7 +15942,7 @@
                 <w:sz w:val="16"/>
                 <w:szCs w:val="16"/>
               </w:rPr>
-              <w:t xml:space="preserve">SALES_UOM_CODE</w:t>
+              <w:t xml:space="preserve">SHIPPABLE_FLAG</w:t>
             </w:r>
           </w:p>
         </w:tc>
@@ -15589,7 +15965,7 @@
                 <w:sz w:val="16"/>
                 <w:szCs w:val="16"/>
               </w:rPr>
-              <w:t xml:space="preserve">VARCHAR2(10)</w:t>
+              <w:t xml:space="preserve">VARCHAR2(1)</w:t>
             </w:r>
           </w:p>
         </w:tc>
@@ -15612,7 +15988,7 @@
                 <w:sz w:val="16"/>
                 <w:szCs w:val="16"/>
               </w:rPr>
-              <w:t xml:space="preserve">N</w:t>
+              <w:t xml:space="preserve">Y</w:t>
             </w:r>
           </w:p>
         </w:tc>
@@ -15635,7 +16011,7 @@
                 <w:sz w:val="16"/>
                 <w:szCs w:val="16"/>
               </w:rPr>
-              <w:t xml:space="preserve">Default sales UOM</w:t>
+              <w:t xml:space="preserve">Physically shipped (N for services/fees)</w:t>
             </w:r>
           </w:p>
         </w:tc>
@@ -15660,6 +16036,194 @@
                 <w:sz w:val="16"/>
                 <w:szCs w:val="16"/>
               </w:rPr>
+              <w:t xml:space="preserve">INVOICEABLE_FLAG</w:t>
+            </w:r>
+          </w:p>
+        </w:tc>
+        <w:tc>
+          <w:tcPr>
+            <w:tcW w:type="dxa" w:w="1358"/>
+            <w:tcMar>
+              <w:top w:type="dxa" w:w="40"/>
+              <w:left w:type="dxa" w:w="70"/>
+              <w:bottom w:type="dxa" w:w="40"/>
+              <w:right w:type="dxa" w:w="70"/>
+            </w:tcMar>
+          </w:tcPr>
+          <w:p>
+            <w:r>
+              <w:rPr>
+                <w:b w:val="false"/>
+                <w:bCs w:val="false"/>
+                <w:color w:val="1A1A1A"/>
+                <w:sz w:val="16"/>
+                <w:szCs w:val="16"/>
+              </w:rPr>
+              <w:t xml:space="preserve">VARCHAR2(1)</w:t>
+            </w:r>
+          </w:p>
+        </w:tc>
+        <w:tc>
+          <w:tcPr>
+            <w:tcW w:type="dxa" w:w="679"/>
+            <w:tcMar>
+              <w:top w:type="dxa" w:w="40"/>
+              <w:left w:type="dxa" w:w="70"/>
+              <w:bottom w:type="dxa" w:w="40"/>
+              <w:right w:type="dxa" w:w="70"/>
+            </w:tcMar>
+          </w:tcPr>
+          <w:p>
+            <w:r>
+              <w:rPr>
+                <w:b w:val="false"/>
+                <w:bCs w:val="false"/>
+                <w:color w:val="1A1A1A"/>
+                <w:sz w:val="16"/>
+                <w:szCs w:val="16"/>
+              </w:rPr>
+              <w:t xml:space="preserve">Y</w:t>
+            </w:r>
+          </w:p>
+        </w:tc>
+        <w:tc>
+          <w:tcPr>
+            <w:tcW w:type="dxa" w:w="5141"/>
+            <w:tcMar>
+              <w:top w:type="dxa" w:w="40"/>
+              <w:left w:type="dxa" w:w="70"/>
+              <w:bottom w:type="dxa" w:w="40"/>
+              <w:right w:type="dxa" w:w="70"/>
+            </w:tcMar>
+          </w:tcPr>
+          <w:p>
+            <w:r>
+              <w:rPr>
+                <w:b w:val="false"/>
+                <w:bCs w:val="false"/>
+                <w:color w:val="1A1A1A"/>
+                <w:sz w:val="16"/>
+                <w:szCs w:val="16"/>
+              </w:rPr>
+              <w:t xml:space="preserve">Generates AR invoice lines (default Y)</w:t>
+            </w:r>
+          </w:p>
+        </w:tc>
+      </w:tr>
+      <w:tr>
+        <w:tc>
+          <w:tcPr>
+            <w:tcW w:type="dxa" w:w="2522"/>
+            <w:tcMar>
+              <w:top w:type="dxa" w:w="40"/>
+              <w:left w:type="dxa" w:w="70"/>
+              <w:bottom w:type="dxa" w:w="40"/>
+              <w:right w:type="dxa" w:w="70"/>
+            </w:tcMar>
+          </w:tcPr>
+          <w:p>
+            <w:r>
+              <w:rPr>
+                <w:b w:val="false"/>
+                <w:bCs w:val="false"/>
+                <w:color w:val="1A1A1A"/>
+                <w:sz w:val="16"/>
+                <w:szCs w:val="16"/>
+              </w:rPr>
+              <w:t xml:space="preserve">ATP_CHECK_FLAG</w:t>
+            </w:r>
+          </w:p>
+        </w:tc>
+        <w:tc>
+          <w:tcPr>
+            <w:tcW w:type="dxa" w:w="1358"/>
+            <w:tcMar>
+              <w:top w:type="dxa" w:w="40"/>
+              <w:left w:type="dxa" w:w="70"/>
+              <w:bottom w:type="dxa" w:w="40"/>
+              <w:right w:type="dxa" w:w="70"/>
+            </w:tcMar>
+          </w:tcPr>
+          <w:p>
+            <w:r>
+              <w:rPr>
+                <w:b w:val="false"/>
+                <w:bCs w:val="false"/>
+                <w:color w:val="1A1A1A"/>
+                <w:sz w:val="16"/>
+                <w:szCs w:val="16"/>
+              </w:rPr>
+              <w:t xml:space="preserve">VARCHAR2(1)</w:t>
+            </w:r>
+          </w:p>
+        </w:tc>
+        <w:tc>
+          <w:tcPr>
+            <w:tcW w:type="dxa" w:w="679"/>
+            <w:tcMar>
+              <w:top w:type="dxa" w:w="40"/>
+              <w:left w:type="dxa" w:w="70"/>
+              <w:bottom w:type="dxa" w:w="40"/>
+              <w:right w:type="dxa" w:w="70"/>
+            </w:tcMar>
+          </w:tcPr>
+          <w:p>
+            <w:r>
+              <w:rPr>
+                <w:b w:val="false"/>
+                <w:bCs w:val="false"/>
+                <w:color w:val="1A1A1A"/>
+                <w:sz w:val="16"/>
+                <w:szCs w:val="16"/>
+              </w:rPr>
+              <w:t xml:space="preserve">Y</w:t>
+            </w:r>
+          </w:p>
+        </w:tc>
+        <w:tc>
+          <w:tcPr>
+            <w:tcW w:type="dxa" w:w="5141"/>
+            <w:tcMar>
+              <w:top w:type="dxa" w:w="40"/>
+              <w:left w:type="dxa" w:w="70"/>
+              <w:bottom w:type="dxa" w:w="40"/>
+              <w:right w:type="dxa" w:w="70"/>
+            </w:tcMar>
+          </w:tcPr>
+          <w:p>
+            <w:r>
+              <w:rPr>
+                <w:b w:val="false"/>
+                <w:bCs w:val="false"/>
+                <w:color w:val="1A1A1A"/>
+                <w:sz w:val="16"/>
+                <w:szCs w:val="16"/>
+              </w:rPr>
+              <w:t xml:space="preserve">Availability check at order entry (default Y)</w:t>
+            </w:r>
+          </w:p>
+        </w:tc>
+      </w:tr>
+      <w:tr>
+        <w:tc>
+          <w:tcPr>
+            <w:tcW w:type="dxa" w:w="2522"/>
+            <w:tcMar>
+              <w:top w:type="dxa" w:w="40"/>
+              <w:left w:type="dxa" w:w="70"/>
+              <w:bottom w:type="dxa" w:w="40"/>
+              <w:right w:type="dxa" w:w="70"/>
+            </w:tcMar>
+          </w:tcPr>
+          <w:p>
+            <w:r>
+              <w:rPr>
+                <w:b w:val="false"/>
+                <w:bCs w:val="false"/>
+                <w:color w:val="1A1A1A"/>
+                <w:sz w:val="16"/>
+                <w:szCs w:val="16"/>
+              </w:rPr>
               <w:t xml:space="preserve">RETURNABLE_FLAG</w:t>
             </w:r>
           </w:p>
@@ -15729,7 +16293,1335 @@
                 <w:sz w:val="16"/>
                 <w:szCs w:val="16"/>
               </w:rPr>
-              <w:t xml:space="preserve">Phase 3 returns (default Y)</w:t>
+              <w:t xml:space="preserve">Customer returns allowed (default Y)</w:t>
+            </w:r>
+          </w:p>
+        </w:tc>
+      </w:tr>
+      <w:tr>
+        <w:tc>
+          <w:tcPr>
+            <w:tcW w:type="dxa" w:w="2522"/>
+            <w:tcMar>
+              <w:top w:type="dxa" w:w="40"/>
+              <w:left w:type="dxa" w:w="70"/>
+              <w:bottom w:type="dxa" w:w="40"/>
+              <w:right w:type="dxa" w:w="70"/>
+            </w:tcMar>
+          </w:tcPr>
+          <w:p>
+            <w:r>
+              <w:rPr>
+                <w:b w:val="false"/>
+                <w:bCs w:val="false"/>
+                <w:color w:val="1A1A1A"/>
+                <w:sz w:val="16"/>
+                <w:szCs w:val="16"/>
+              </w:rPr>
+              <w:t xml:space="preserve">SELLING_PRICE</w:t>
+            </w:r>
+          </w:p>
+        </w:tc>
+        <w:tc>
+          <w:tcPr>
+            <w:tcW w:type="dxa" w:w="1358"/>
+            <w:tcMar>
+              <w:top w:type="dxa" w:w="40"/>
+              <w:left w:type="dxa" w:w="70"/>
+              <w:bottom w:type="dxa" w:w="40"/>
+              <w:right w:type="dxa" w:w="70"/>
+            </w:tcMar>
+          </w:tcPr>
+          <w:p>
+            <w:r>
+              <w:rPr>
+                <w:b w:val="false"/>
+                <w:bCs w:val="false"/>
+                <w:color w:val="1A1A1A"/>
+                <w:sz w:val="16"/>
+                <w:szCs w:val="16"/>
+              </w:rPr>
+              <w:t xml:space="preserve">NUMBER</w:t>
+            </w:r>
+          </w:p>
+        </w:tc>
+        <w:tc>
+          <w:tcPr>
+            <w:tcW w:type="dxa" w:w="679"/>
+            <w:tcMar>
+              <w:top w:type="dxa" w:w="40"/>
+              <w:left w:type="dxa" w:w="70"/>
+              <w:bottom w:type="dxa" w:w="40"/>
+              <w:right w:type="dxa" w:w="70"/>
+            </w:tcMar>
+          </w:tcPr>
+          <w:p>
+            <w:r>
+              <w:rPr>
+                <w:b w:val="false"/>
+                <w:bCs w:val="false"/>
+                <w:color w:val="1A1A1A"/>
+                <w:sz w:val="16"/>
+                <w:szCs w:val="16"/>
+              </w:rPr>
+              <w:t xml:space="preserve">N</w:t>
+            </w:r>
+          </w:p>
+        </w:tc>
+        <w:tc>
+          <w:tcPr>
+            <w:tcW w:type="dxa" w:w="5141"/>
+            <w:tcMar>
+              <w:top w:type="dxa" w:w="40"/>
+              <w:left w:type="dxa" w:w="70"/>
+              <w:bottom w:type="dxa" w:w="40"/>
+              <w:right w:type="dxa" w:w="70"/>
+            </w:tcMar>
+          </w:tcPr>
+          <w:p>
+            <w:r>
+              <w:rPr>
+                <w:b w:val="false"/>
+                <w:bCs w:val="false"/>
+                <w:color w:val="1A1A1A"/>
+                <w:sz w:val="16"/>
+                <w:szCs w:val="16"/>
+              </w:rPr>
+              <w:t xml:space="preserve">Default selling price</w:t>
+            </w:r>
+          </w:p>
+        </w:tc>
+      </w:tr>
+      <w:tr>
+        <w:tc>
+          <w:tcPr>
+            <w:tcW w:type="dxa" w:w="2522"/>
+            <w:tcMar>
+              <w:top w:type="dxa" w:w="40"/>
+              <w:left w:type="dxa" w:w="70"/>
+              <w:bottom w:type="dxa" w:w="40"/>
+              <w:right w:type="dxa" w:w="70"/>
+            </w:tcMar>
+          </w:tcPr>
+          <w:p>
+            <w:r>
+              <w:rPr>
+                <w:b w:val="false"/>
+                <w:bCs w:val="false"/>
+                <w:color w:val="1A1A1A"/>
+                <w:sz w:val="16"/>
+                <w:szCs w:val="16"/>
+              </w:rPr>
+              <w:t xml:space="preserve">SALES_UOM_CODE</w:t>
+            </w:r>
+          </w:p>
+        </w:tc>
+        <w:tc>
+          <w:tcPr>
+            <w:tcW w:type="dxa" w:w="1358"/>
+            <w:tcMar>
+              <w:top w:type="dxa" w:w="40"/>
+              <w:left w:type="dxa" w:w="70"/>
+              <w:bottom w:type="dxa" w:w="40"/>
+              <w:right w:type="dxa" w:w="70"/>
+            </w:tcMar>
+          </w:tcPr>
+          <w:p>
+            <w:r>
+              <w:rPr>
+                <w:b w:val="false"/>
+                <w:bCs w:val="false"/>
+                <w:color w:val="1A1A1A"/>
+                <w:sz w:val="16"/>
+                <w:szCs w:val="16"/>
+              </w:rPr>
+              <w:t xml:space="preserve">VARCHAR2(10)</w:t>
+            </w:r>
+          </w:p>
+        </w:tc>
+        <w:tc>
+          <w:tcPr>
+            <w:tcW w:type="dxa" w:w="679"/>
+            <w:tcMar>
+              <w:top w:type="dxa" w:w="40"/>
+              <w:left w:type="dxa" w:w="70"/>
+              <w:bottom w:type="dxa" w:w="40"/>
+              <w:right w:type="dxa" w:w="70"/>
+            </w:tcMar>
+          </w:tcPr>
+          <w:p>
+            <w:r>
+              <w:rPr>
+                <w:b w:val="false"/>
+                <w:bCs w:val="false"/>
+                <w:color w:val="1A1A1A"/>
+                <w:sz w:val="16"/>
+                <w:szCs w:val="16"/>
+              </w:rPr>
+              <w:t xml:space="preserve">N</w:t>
+            </w:r>
+          </w:p>
+        </w:tc>
+        <w:tc>
+          <w:tcPr>
+            <w:tcW w:type="dxa" w:w="5141"/>
+            <w:tcMar>
+              <w:top w:type="dxa" w:w="40"/>
+              <w:left w:type="dxa" w:w="70"/>
+              <w:bottom w:type="dxa" w:w="40"/>
+              <w:right w:type="dxa" w:w="70"/>
+            </w:tcMar>
+          </w:tcPr>
+          <w:p>
+            <w:r>
+              <w:rPr>
+                <w:b w:val="false"/>
+                <w:bCs w:val="false"/>
+                <w:color w:val="1A1A1A"/>
+                <w:sz w:val="16"/>
+                <w:szCs w:val="16"/>
+              </w:rPr>
+              <w:t xml:space="preserve">Default sales UOM</w:t>
+            </w:r>
+          </w:p>
+        </w:tc>
+      </w:tr>
+      <w:tr>
+        <w:tc>
+          <w:tcPr>
+            <w:tcW w:type="dxa" w:w="2522"/>
+            <w:tcMar>
+              <w:top w:type="dxa" w:w="40"/>
+              <w:left w:type="dxa" w:w="70"/>
+              <w:bottom w:type="dxa" w:w="40"/>
+              <w:right w:type="dxa" w:w="70"/>
+            </w:tcMar>
+          </w:tcPr>
+          <w:p>
+            <w:r>
+              <w:rPr>
+                <w:b w:val="false"/>
+                <w:bCs w:val="false"/>
+                <w:color w:val="1A1A1A"/>
+                <w:sz w:val="16"/>
+                <w:szCs w:val="16"/>
+              </w:rPr>
+              <w:t xml:space="preserve">OVERSHIP_TOLERANCE_PCT / UNDERSHIP_TOLERANCE_PCT</w:t>
+            </w:r>
+          </w:p>
+        </w:tc>
+        <w:tc>
+          <w:tcPr>
+            <w:tcW w:type="dxa" w:w="1358"/>
+            <w:tcMar>
+              <w:top w:type="dxa" w:w="40"/>
+              <w:left w:type="dxa" w:w="70"/>
+              <w:bottom w:type="dxa" w:w="40"/>
+              <w:right w:type="dxa" w:w="70"/>
+            </w:tcMar>
+          </w:tcPr>
+          <w:p>
+            <w:r>
+              <w:rPr>
+                <w:b w:val="false"/>
+                <w:bCs w:val="false"/>
+                <w:color w:val="1A1A1A"/>
+                <w:sz w:val="16"/>
+                <w:szCs w:val="16"/>
+              </w:rPr>
+              <w:t xml:space="preserve">NUMBER</w:t>
+            </w:r>
+          </w:p>
+        </w:tc>
+        <w:tc>
+          <w:tcPr>
+            <w:tcW w:type="dxa" w:w="679"/>
+            <w:tcMar>
+              <w:top w:type="dxa" w:w="40"/>
+              <w:left w:type="dxa" w:w="70"/>
+              <w:bottom w:type="dxa" w:w="40"/>
+              <w:right w:type="dxa" w:w="70"/>
+            </w:tcMar>
+          </w:tcPr>
+          <w:p>
+            <w:r>
+              <w:rPr>
+                <w:b w:val="false"/>
+                <w:bCs w:val="false"/>
+                <w:color w:val="1A1A1A"/>
+                <w:sz w:val="16"/>
+                <w:szCs w:val="16"/>
+              </w:rPr>
+              <w:t xml:space="preserve">N</w:t>
+            </w:r>
+          </w:p>
+        </w:tc>
+        <w:tc>
+          <w:tcPr>
+            <w:tcW w:type="dxa" w:w="5141"/>
+            <w:tcMar>
+              <w:top w:type="dxa" w:w="40"/>
+              <w:left w:type="dxa" w:w="70"/>
+              <w:bottom w:type="dxa" w:w="40"/>
+              <w:right w:type="dxa" w:w="70"/>
+            </w:tcMar>
+          </w:tcPr>
+          <w:p>
+            <w:r>
+              <w:rPr>
+                <w:b w:val="false"/>
+                <w:bCs w:val="false"/>
+                <w:color w:val="1A1A1A"/>
+                <w:sz w:val="16"/>
+                <w:szCs w:val="16"/>
+              </w:rPr>
+              <w:t xml:space="preserve">Fulfilment tolerances (Phase 3)</w:t>
+            </w:r>
+          </w:p>
+        </w:tc>
+      </w:tr>
+      <w:tr>
+        <w:tc>
+          <w:tcPr>
+            <w:tcW w:type="dxa" w:w="2522"/>
+            <w:tcMar>
+              <w:top w:type="dxa" w:w="40"/>
+              <w:left w:type="dxa" w:w="70"/>
+              <w:bottom w:type="dxa" w:w="40"/>
+              <w:right w:type="dxa" w:w="70"/>
+            </w:tcMar>
+          </w:tcPr>
+          <w:p>
+            <w:r>
+              <w:rPr>
+                <w:b w:val="false"/>
+                <w:bCs w:val="false"/>
+                <w:color w:val="1A1A1A"/>
+                <w:sz w:val="16"/>
+                <w:szCs w:val="16"/>
+              </w:rPr>
+              <w:t xml:space="preserve">SALES_TAX_CODE</w:t>
+            </w:r>
+          </w:p>
+        </w:tc>
+        <w:tc>
+          <w:tcPr>
+            <w:tcW w:type="dxa" w:w="1358"/>
+            <w:tcMar>
+              <w:top w:type="dxa" w:w="40"/>
+              <w:left w:type="dxa" w:w="70"/>
+              <w:bottom w:type="dxa" w:w="40"/>
+              <w:right w:type="dxa" w:w="70"/>
+            </w:tcMar>
+          </w:tcPr>
+          <w:p>
+            <w:r>
+              <w:rPr>
+                <w:b w:val="false"/>
+                <w:bCs w:val="false"/>
+                <w:color w:val="1A1A1A"/>
+                <w:sz w:val="16"/>
+                <w:szCs w:val="16"/>
+              </w:rPr>
+              <w:t xml:space="preserve">VARCHAR2(30)</w:t>
+            </w:r>
+          </w:p>
+        </w:tc>
+        <w:tc>
+          <w:tcPr>
+            <w:tcW w:type="dxa" w:w="679"/>
+            <w:tcMar>
+              <w:top w:type="dxa" w:w="40"/>
+              <w:left w:type="dxa" w:w="70"/>
+              <w:bottom w:type="dxa" w:w="40"/>
+              <w:right w:type="dxa" w:w="70"/>
+            </w:tcMar>
+          </w:tcPr>
+          <w:p>
+            <w:r>
+              <w:rPr>
+                <w:b w:val="false"/>
+                <w:bCs w:val="false"/>
+                <w:color w:val="1A1A1A"/>
+                <w:sz w:val="16"/>
+                <w:szCs w:val="16"/>
+              </w:rPr>
+              <w:t xml:space="preserve">N</w:t>
+            </w:r>
+          </w:p>
+        </w:tc>
+        <w:tc>
+          <w:tcPr>
+            <w:tcW w:type="dxa" w:w="5141"/>
+            <w:tcMar>
+              <w:top w:type="dxa" w:w="40"/>
+              <w:left w:type="dxa" w:w="70"/>
+              <w:bottom w:type="dxa" w:w="40"/>
+              <w:right w:type="dxa" w:w="70"/>
+            </w:tcMar>
+          </w:tcPr>
+          <w:p>
+            <w:r>
+              <w:rPr>
+                <w:b w:val="false"/>
+                <w:bCs w:val="false"/>
+                <w:color w:val="1A1A1A"/>
+                <w:sz w:val="16"/>
+                <w:szCs w:val="16"/>
+              </w:rPr>
+              <w:t xml:space="preserve">Output tax classification (existing Tax module codes, e.g. UAE VAT 5% / zero-rated / exempt)</w:t>
+            </w:r>
+          </w:p>
+        </w:tc>
+      </w:tr>
+      <w:tr>
+        <w:tc>
+          <w:tcPr>
+            <w:tcW w:type="dxa" w:w="2522"/>
+            <w:tcMar>
+              <w:top w:type="dxa" w:w="40"/>
+              <w:left w:type="dxa" w:w="70"/>
+              <w:bottom w:type="dxa" w:w="40"/>
+              <w:right w:type="dxa" w:w="70"/>
+            </w:tcMar>
+          </w:tcPr>
+          <w:p>
+            <w:r>
+              <w:rPr>
+                <w:b w:val="false"/>
+                <w:bCs w:val="false"/>
+                <w:color w:val="1A1A1A"/>
+                <w:sz w:val="16"/>
+                <w:szCs w:val="16"/>
+              </w:rPr>
+              <w:t xml:space="preserve">TAXABLE_FLAG</w:t>
+            </w:r>
+          </w:p>
+        </w:tc>
+        <w:tc>
+          <w:tcPr>
+            <w:tcW w:type="dxa" w:w="1358"/>
+            <w:tcMar>
+              <w:top w:type="dxa" w:w="40"/>
+              <w:left w:type="dxa" w:w="70"/>
+              <w:bottom w:type="dxa" w:w="40"/>
+              <w:right w:type="dxa" w:w="70"/>
+            </w:tcMar>
+          </w:tcPr>
+          <w:p>
+            <w:r>
+              <w:rPr>
+                <w:b w:val="false"/>
+                <w:bCs w:val="false"/>
+                <w:color w:val="1A1A1A"/>
+                <w:sz w:val="16"/>
+                <w:szCs w:val="16"/>
+              </w:rPr>
+              <w:t xml:space="preserve">VARCHAR2(1)</w:t>
+            </w:r>
+          </w:p>
+        </w:tc>
+        <w:tc>
+          <w:tcPr>
+            <w:tcW w:type="dxa" w:w="679"/>
+            <w:tcMar>
+              <w:top w:type="dxa" w:w="40"/>
+              <w:left w:type="dxa" w:w="70"/>
+              <w:bottom w:type="dxa" w:w="40"/>
+              <w:right w:type="dxa" w:w="70"/>
+            </w:tcMar>
+          </w:tcPr>
+          <w:p>
+            <w:r>
+              <w:rPr>
+                <w:b w:val="false"/>
+                <w:bCs w:val="false"/>
+                <w:color w:val="1A1A1A"/>
+                <w:sz w:val="16"/>
+                <w:szCs w:val="16"/>
+              </w:rPr>
+              <w:t xml:space="preserve">Y</w:t>
+            </w:r>
+          </w:p>
+        </w:tc>
+        <w:tc>
+          <w:tcPr>
+            <w:tcW w:type="dxa" w:w="5141"/>
+            <w:tcMar>
+              <w:top w:type="dxa" w:w="40"/>
+              <w:left w:type="dxa" w:w="70"/>
+              <w:bottom w:type="dxa" w:w="40"/>
+              <w:right w:type="dxa" w:w="70"/>
+            </w:tcMar>
+          </w:tcPr>
+          <w:p>
+            <w:r>
+              <w:rPr>
+                <w:b w:val="false"/>
+                <w:bCs w:val="false"/>
+                <w:color w:val="1A1A1A"/>
+                <w:sz w:val="16"/>
+                <w:szCs w:val="16"/>
+              </w:rPr>
+              <w:t xml:space="preserve">Line is taxable on sales documents (default Y)</w:t>
+            </w:r>
+          </w:p>
+        </w:tc>
+      </w:tr>
+    </w:tbl>
+    <w:p>
+      <w:pPr>
+        <w:spacing w:after="100"/>
+      </w:pPr>
+    </w:p>
+    <w:p>
+      <w:pPr>
+        <w:pStyle w:val="Heading3"/>
+        <w:spacing w:after="60" w:before="140"/>
+      </w:pPr>
+      <w:r>
+        <w:rPr>
+          <w:b/>
+          <w:bCs/>
+          <w:color w:val="6B6B6B"/>
+          <w:sz w:val="21"/>
+          <w:szCs w:val="21"/>
+        </w:rPr>
+        <w:t xml:space="preserve">Group: Accounting</w:t>
+      </w:r>
+    </w:p>
+    <w:p>
+      <w:pPr>
+        <w:spacing w:after="100"/>
+      </w:pPr>
+      <w:r>
+        <w:rPr>
+          <w:sz w:val="20"/>
+          <w:szCs w:val="20"/>
+        </w:rPr>
+        <w:t xml:space="preserve">Default distribution accounts used when documents for this item are accounted. All are full code combinations picked with AccountSelector; each is org-overridable on the assignment row (5.4), and document-level entry can still override at transaction time.</w:t>
+      </w:r>
+    </w:p>
+    <w:tbl>
+      <w:tblPr>
+        <w:tblW w:type="dxa" w:w="9700"/>
+        <w:tblBorders>
+          <w:top w:val="single" w:color="auto" w:sz="4"/>
+          <w:left w:val="single" w:color="auto" w:sz="4"/>
+          <w:bottom w:val="single" w:color="auto" w:sz="4"/>
+          <w:right w:val="single" w:color="auto" w:sz="4"/>
+          <w:insideH w:val="single" w:color="auto" w:sz="4"/>
+          <w:insideV w:val="single" w:color="auto" w:sz="4"/>
+        </w:tblBorders>
+      </w:tblPr>
+      <w:tblGrid>
+        <w:gridCol w:w="2522"/>
+        <w:gridCol w:w="1358"/>
+        <w:gridCol w:w="679"/>
+        <w:gridCol w:w="5141"/>
+      </w:tblGrid>
+      <w:tr>
+        <w:trPr>
+          <w:tblHeader/>
+        </w:trPr>
+        <w:tc>
+          <w:tcPr>
+            <w:tcW w:type="dxa" w:w="2522"/>
+            <w:shd w:fill="C74634" w:val="clear"/>
+            <w:tcMar>
+              <w:top w:type="dxa" w:w="40"/>
+              <w:left w:type="dxa" w:w="70"/>
+              <w:bottom w:type="dxa" w:w="40"/>
+              <w:right w:type="dxa" w:w="70"/>
+            </w:tcMar>
+          </w:tcPr>
+          <w:p>
+            <w:r>
+              <w:rPr>
+                <w:b/>
+                <w:bCs/>
+                <w:color w:val="FFFFFF"/>
+                <w:sz w:val="16"/>
+                <w:szCs w:val="16"/>
+              </w:rPr>
+              <w:t xml:space="preserve">Column</w:t>
+            </w:r>
+          </w:p>
+        </w:tc>
+        <w:tc>
+          <w:tcPr>
+            <w:tcW w:type="dxa" w:w="1358"/>
+            <w:shd w:fill="C74634" w:val="clear"/>
+            <w:tcMar>
+              <w:top w:type="dxa" w:w="40"/>
+              <w:left w:type="dxa" w:w="70"/>
+              <w:bottom w:type="dxa" w:w="40"/>
+              <w:right w:type="dxa" w:w="70"/>
+            </w:tcMar>
+          </w:tcPr>
+          <w:p>
+            <w:r>
+              <w:rPr>
+                <w:b/>
+                <w:bCs/>
+                <w:color w:val="FFFFFF"/>
+                <w:sz w:val="16"/>
+                <w:szCs w:val="16"/>
+              </w:rPr>
+              <w:t xml:space="preserve">Type</w:t>
+            </w:r>
+          </w:p>
+        </w:tc>
+        <w:tc>
+          <w:tcPr>
+            <w:tcW w:type="dxa" w:w="679"/>
+            <w:shd w:fill="C74634" w:val="clear"/>
+            <w:tcMar>
+              <w:top w:type="dxa" w:w="40"/>
+              <w:left w:type="dxa" w:w="70"/>
+              <w:bottom w:type="dxa" w:w="40"/>
+              <w:right w:type="dxa" w:w="70"/>
+            </w:tcMar>
+          </w:tcPr>
+          <w:p>
+            <w:r>
+              <w:rPr>
+                <w:b/>
+                <w:bCs/>
+                <w:color w:val="FFFFFF"/>
+                <w:sz w:val="16"/>
+                <w:szCs w:val="16"/>
+              </w:rPr>
+              <w:t xml:space="preserve">Req</w:t>
+            </w:r>
+          </w:p>
+        </w:tc>
+        <w:tc>
+          <w:tcPr>
+            <w:tcW w:type="dxa" w:w="5141"/>
+            <w:shd w:fill="C74634" w:val="clear"/>
+            <w:tcMar>
+              <w:top w:type="dxa" w:w="40"/>
+              <w:left w:type="dxa" w:w="70"/>
+              <w:bottom w:type="dxa" w:w="40"/>
+              <w:right w:type="dxa" w:w="70"/>
+            </w:tcMar>
+          </w:tcPr>
+          <w:p>
+            <w:r>
+              <w:rPr>
+                <w:b/>
+                <w:bCs/>
+                <w:color w:val="FFFFFF"/>
+                <w:sz w:val="16"/>
+                <w:szCs w:val="16"/>
+              </w:rPr>
+              <w:t xml:space="preserve">Description</w:t>
+            </w:r>
+          </w:p>
+        </w:tc>
+      </w:tr>
+      <w:tr>
+        <w:tc>
+          <w:tcPr>
+            <w:tcW w:type="dxa" w:w="2522"/>
+            <w:tcMar>
+              <w:top w:type="dxa" w:w="40"/>
+              <w:left w:type="dxa" w:w="70"/>
+              <w:bottom w:type="dxa" w:w="40"/>
+              <w:right w:type="dxa" w:w="70"/>
+            </w:tcMar>
+          </w:tcPr>
+          <w:p>
+            <w:r>
+              <w:rPr>
+                <w:b w:val="false"/>
+                <w:bCs w:val="false"/>
+                <w:color w:val="1A1A1A"/>
+                <w:sz w:val="16"/>
+                <w:szCs w:val="16"/>
+              </w:rPr>
+              <w:t xml:space="preserve">SALES_ACCOUNT</w:t>
+            </w:r>
+          </w:p>
+        </w:tc>
+        <w:tc>
+          <w:tcPr>
+            <w:tcW w:type="dxa" w:w="1358"/>
+            <w:tcMar>
+              <w:top w:type="dxa" w:w="40"/>
+              <w:left w:type="dxa" w:w="70"/>
+              <w:bottom w:type="dxa" w:w="40"/>
+              <w:right w:type="dxa" w:w="70"/>
+            </w:tcMar>
+          </w:tcPr>
+          <w:p>
+            <w:r>
+              <w:rPr>
+                <w:b w:val="false"/>
+                <w:bCs w:val="false"/>
+                <w:color w:val="1A1A1A"/>
+                <w:sz w:val="16"/>
+                <w:szCs w:val="16"/>
+              </w:rPr>
+              <w:t xml:space="preserve">VARCHAR2(500)</w:t>
+            </w:r>
+          </w:p>
+        </w:tc>
+        <w:tc>
+          <w:tcPr>
+            <w:tcW w:type="dxa" w:w="679"/>
+            <w:tcMar>
+              <w:top w:type="dxa" w:w="40"/>
+              <w:left w:type="dxa" w:w="70"/>
+              <w:bottom w:type="dxa" w:w="40"/>
+              <w:right w:type="dxa" w:w="70"/>
+            </w:tcMar>
+          </w:tcPr>
+          <w:p>
+            <w:r>
+              <w:rPr>
+                <w:b w:val="false"/>
+                <w:bCs w:val="false"/>
+                <w:color w:val="1A1A1A"/>
+                <w:sz w:val="16"/>
+                <w:szCs w:val="16"/>
+              </w:rPr>
+              <w:t xml:space="preserve">N</w:t>
+            </w:r>
+          </w:p>
+        </w:tc>
+        <w:tc>
+          <w:tcPr>
+            <w:tcW w:type="dxa" w:w="5141"/>
+            <w:tcMar>
+              <w:top w:type="dxa" w:w="40"/>
+              <w:left w:type="dxa" w:w="70"/>
+              <w:bottom w:type="dxa" w:w="40"/>
+              <w:right w:type="dxa" w:w="70"/>
+            </w:tcMar>
+          </w:tcPr>
+          <w:p>
+            <w:r>
+              <w:rPr>
+                <w:b w:val="false"/>
+                <w:bCs w:val="false"/>
+                <w:color w:val="1A1A1A"/>
+                <w:sz w:val="16"/>
+                <w:szCs w:val="16"/>
+              </w:rPr>
+              <w:t xml:space="preserve">Revenue account credited by AR invoicing (Phase 3)</w:t>
+            </w:r>
+          </w:p>
+        </w:tc>
+      </w:tr>
+      <w:tr>
+        <w:tc>
+          <w:tcPr>
+            <w:tcW w:type="dxa" w:w="2522"/>
+            <w:tcMar>
+              <w:top w:type="dxa" w:w="40"/>
+              <w:left w:type="dxa" w:w="70"/>
+              <w:bottom w:type="dxa" w:w="40"/>
+              <w:right w:type="dxa" w:w="70"/>
+            </w:tcMar>
+          </w:tcPr>
+          <w:p>
+            <w:r>
+              <w:rPr>
+                <w:b w:val="false"/>
+                <w:bCs w:val="false"/>
+                <w:color w:val="1A1A1A"/>
+                <w:sz w:val="16"/>
+                <w:szCs w:val="16"/>
+              </w:rPr>
+              <w:t xml:space="preserve">SALES_RETURN_ACCOUNT</w:t>
+            </w:r>
+          </w:p>
+        </w:tc>
+        <w:tc>
+          <w:tcPr>
+            <w:tcW w:type="dxa" w:w="1358"/>
+            <w:tcMar>
+              <w:top w:type="dxa" w:w="40"/>
+              <w:left w:type="dxa" w:w="70"/>
+              <w:bottom w:type="dxa" w:w="40"/>
+              <w:right w:type="dxa" w:w="70"/>
+            </w:tcMar>
+          </w:tcPr>
+          <w:p>
+            <w:r>
+              <w:rPr>
+                <w:b w:val="false"/>
+                <w:bCs w:val="false"/>
+                <w:color w:val="1A1A1A"/>
+                <w:sz w:val="16"/>
+                <w:szCs w:val="16"/>
+              </w:rPr>
+              <w:t xml:space="preserve">VARCHAR2(500)</w:t>
+            </w:r>
+          </w:p>
+        </w:tc>
+        <w:tc>
+          <w:tcPr>
+            <w:tcW w:type="dxa" w:w="679"/>
+            <w:tcMar>
+              <w:top w:type="dxa" w:w="40"/>
+              <w:left w:type="dxa" w:w="70"/>
+              <w:bottom w:type="dxa" w:w="40"/>
+              <w:right w:type="dxa" w:w="70"/>
+            </w:tcMar>
+          </w:tcPr>
+          <w:p>
+            <w:r>
+              <w:rPr>
+                <w:b w:val="false"/>
+                <w:bCs w:val="false"/>
+                <w:color w:val="1A1A1A"/>
+                <w:sz w:val="16"/>
+                <w:szCs w:val="16"/>
+              </w:rPr>
+              <w:t xml:space="preserve">N</w:t>
+            </w:r>
+          </w:p>
+        </w:tc>
+        <w:tc>
+          <w:tcPr>
+            <w:tcW w:type="dxa" w:w="5141"/>
+            <w:tcMar>
+              <w:top w:type="dxa" w:w="40"/>
+              <w:left w:type="dxa" w:w="70"/>
+              <w:bottom w:type="dxa" w:w="40"/>
+              <w:right w:type="dxa" w:w="70"/>
+            </w:tcMar>
+          </w:tcPr>
+          <w:p>
+            <w:r>
+              <w:rPr>
+                <w:b w:val="false"/>
+                <w:bCs w:val="false"/>
+                <w:color w:val="1A1A1A"/>
+                <w:sz w:val="16"/>
+                <w:szCs w:val="16"/>
+              </w:rPr>
+              <w:t xml:space="preserve">Returns / credit memos (falls back to sales account)</w:t>
+            </w:r>
+          </w:p>
+        </w:tc>
+      </w:tr>
+      <w:tr>
+        <w:tc>
+          <w:tcPr>
+            <w:tcW w:type="dxa" w:w="2522"/>
+            <w:tcMar>
+              <w:top w:type="dxa" w:w="40"/>
+              <w:left w:type="dxa" w:w="70"/>
+              <w:bottom w:type="dxa" w:w="40"/>
+              <w:right w:type="dxa" w:w="70"/>
+            </w:tcMar>
+          </w:tcPr>
+          <w:p>
+            <w:r>
+              <w:rPr>
+                <w:b w:val="false"/>
+                <w:bCs w:val="false"/>
+                <w:color w:val="1A1A1A"/>
+                <w:sz w:val="16"/>
+                <w:szCs w:val="16"/>
+              </w:rPr>
+              <w:t xml:space="preserve">COGS_ACCOUNT</w:t>
+            </w:r>
+          </w:p>
+        </w:tc>
+        <w:tc>
+          <w:tcPr>
+            <w:tcW w:type="dxa" w:w="1358"/>
+            <w:tcMar>
+              <w:top w:type="dxa" w:w="40"/>
+              <w:left w:type="dxa" w:w="70"/>
+              <w:bottom w:type="dxa" w:w="40"/>
+              <w:right w:type="dxa" w:w="70"/>
+            </w:tcMar>
+          </w:tcPr>
+          <w:p>
+            <w:r>
+              <w:rPr>
+                <w:b w:val="false"/>
+                <w:bCs w:val="false"/>
+                <w:color w:val="1A1A1A"/>
+                <w:sz w:val="16"/>
+                <w:szCs w:val="16"/>
+              </w:rPr>
+              <w:t xml:space="preserve">VARCHAR2(500)</w:t>
+            </w:r>
+          </w:p>
+        </w:tc>
+        <w:tc>
+          <w:tcPr>
+            <w:tcW w:type="dxa" w:w="679"/>
+            <w:tcMar>
+              <w:top w:type="dxa" w:w="40"/>
+              <w:left w:type="dxa" w:w="70"/>
+              <w:bottom w:type="dxa" w:w="40"/>
+              <w:right w:type="dxa" w:w="70"/>
+            </w:tcMar>
+          </w:tcPr>
+          <w:p>
+            <w:r>
+              <w:rPr>
+                <w:b w:val="false"/>
+                <w:bCs w:val="false"/>
+                <w:color w:val="1A1A1A"/>
+                <w:sz w:val="16"/>
+                <w:szCs w:val="16"/>
+              </w:rPr>
+              <w:t xml:space="preserve">N</w:t>
+            </w:r>
+          </w:p>
+        </w:tc>
+        <w:tc>
+          <w:tcPr>
+            <w:tcW w:type="dxa" w:w="5141"/>
+            <w:tcMar>
+              <w:top w:type="dxa" w:w="40"/>
+              <w:left w:type="dxa" w:w="70"/>
+              <w:bottom w:type="dxa" w:w="40"/>
+              <w:right w:type="dxa" w:w="70"/>
+            </w:tcMar>
+          </w:tcPr>
+          <w:p>
+            <w:r>
+              <w:rPr>
+                <w:b w:val="false"/>
+                <w:bCs w:val="false"/>
+                <w:color w:val="1A1A1A"/>
+                <w:sz w:val="16"/>
+                <w:szCs w:val="16"/>
+              </w:rPr>
+              <w:t xml:space="preserve">Cost of goods sold debited on SO_ISSUE (Phase 3)</w:t>
+            </w:r>
+          </w:p>
+        </w:tc>
+      </w:tr>
+      <w:tr>
+        <w:tc>
+          <w:tcPr>
+            <w:tcW w:type="dxa" w:w="2522"/>
+            <w:tcMar>
+              <w:top w:type="dxa" w:w="40"/>
+              <w:left w:type="dxa" w:w="70"/>
+              <w:bottom w:type="dxa" w:w="40"/>
+              <w:right w:type="dxa" w:w="70"/>
+            </w:tcMar>
+          </w:tcPr>
+          <w:p>
+            <w:r>
+              <w:rPr>
+                <w:b w:val="false"/>
+                <w:bCs w:val="false"/>
+                <w:color w:val="1A1A1A"/>
+                <w:sz w:val="16"/>
+                <w:szCs w:val="16"/>
+              </w:rPr>
+              <w:t xml:space="preserve">EXPENSE_ACCOUNT</w:t>
+            </w:r>
+          </w:p>
+        </w:tc>
+        <w:tc>
+          <w:tcPr>
+            <w:tcW w:type="dxa" w:w="1358"/>
+            <w:tcMar>
+              <w:top w:type="dxa" w:w="40"/>
+              <w:left w:type="dxa" w:w="70"/>
+              <w:bottom w:type="dxa" w:w="40"/>
+              <w:right w:type="dxa" w:w="70"/>
+            </w:tcMar>
+          </w:tcPr>
+          <w:p>
+            <w:r>
+              <w:rPr>
+                <w:b w:val="false"/>
+                <w:bCs w:val="false"/>
+                <w:color w:val="1A1A1A"/>
+                <w:sz w:val="16"/>
+                <w:szCs w:val="16"/>
+              </w:rPr>
+              <w:t xml:space="preserve">VARCHAR2(500)</w:t>
+            </w:r>
+          </w:p>
+        </w:tc>
+        <w:tc>
+          <w:tcPr>
+            <w:tcW w:type="dxa" w:w="679"/>
+            <w:tcMar>
+              <w:top w:type="dxa" w:w="40"/>
+              <w:left w:type="dxa" w:w="70"/>
+              <w:bottom w:type="dxa" w:w="40"/>
+              <w:right w:type="dxa" w:w="70"/>
+            </w:tcMar>
+          </w:tcPr>
+          <w:p>
+            <w:r>
+              <w:rPr>
+                <w:b w:val="false"/>
+                <w:bCs w:val="false"/>
+                <w:color w:val="1A1A1A"/>
+                <w:sz w:val="16"/>
+                <w:szCs w:val="16"/>
+              </w:rPr>
+              <w:t xml:space="preserve">N</w:t>
+            </w:r>
+          </w:p>
+        </w:tc>
+        <w:tc>
+          <w:tcPr>
+            <w:tcW w:type="dxa" w:w="5141"/>
+            <w:tcMar>
+              <w:top w:type="dxa" w:w="40"/>
+              <w:left w:type="dxa" w:w="70"/>
+              <w:bottom w:type="dxa" w:w="40"/>
+              <w:right w:type="dxa" w:w="70"/>
+            </w:tcMar>
+          </w:tcPr>
+          <w:p>
+            <w:r>
+              <w:rPr>
+                <w:b w:val="false"/>
+                <w:bCs w:val="false"/>
+                <w:color w:val="1A1A1A"/>
+                <w:sz w:val="16"/>
+                <w:szCs w:val="16"/>
+              </w:rPr>
+              <w:t xml:space="preserve">Charged when issued to expense / non-asset subinventory</w:t>
+            </w:r>
+          </w:p>
+        </w:tc>
+      </w:tr>
+      <w:tr>
+        <w:tc>
+          <w:tcPr>
+            <w:tcW w:type="dxa" w:w="2522"/>
+            <w:tcMar>
+              <w:top w:type="dxa" w:w="40"/>
+              <w:left w:type="dxa" w:w="70"/>
+              <w:bottom w:type="dxa" w:w="40"/>
+              <w:right w:type="dxa" w:w="70"/>
+            </w:tcMar>
+          </w:tcPr>
+          <w:p>
+            <w:r>
+              <w:rPr>
+                <w:b w:val="false"/>
+                <w:bCs w:val="false"/>
+                <w:color w:val="1A1A1A"/>
+                <w:sz w:val="16"/>
+                <w:szCs w:val="16"/>
+              </w:rPr>
+              <w:t xml:space="preserve">PURCHASE_PRICE_VARIANCE_ACCOUNT</w:t>
+            </w:r>
+          </w:p>
+        </w:tc>
+        <w:tc>
+          <w:tcPr>
+            <w:tcW w:type="dxa" w:w="1358"/>
+            <w:tcMar>
+              <w:top w:type="dxa" w:w="40"/>
+              <w:left w:type="dxa" w:w="70"/>
+              <w:bottom w:type="dxa" w:w="40"/>
+              <w:right w:type="dxa" w:w="70"/>
+            </w:tcMar>
+          </w:tcPr>
+          <w:p>
+            <w:r>
+              <w:rPr>
+                <w:b w:val="false"/>
+                <w:bCs w:val="false"/>
+                <w:color w:val="1A1A1A"/>
+                <w:sz w:val="16"/>
+                <w:szCs w:val="16"/>
+              </w:rPr>
+              <w:t xml:space="preserve">VARCHAR2(500)</w:t>
+            </w:r>
+          </w:p>
+        </w:tc>
+        <w:tc>
+          <w:tcPr>
+            <w:tcW w:type="dxa" w:w="679"/>
+            <w:tcMar>
+              <w:top w:type="dxa" w:w="40"/>
+              <w:left w:type="dxa" w:w="70"/>
+              <w:bottom w:type="dxa" w:w="40"/>
+              <w:right w:type="dxa" w:w="70"/>
+            </w:tcMar>
+          </w:tcPr>
+          <w:p>
+            <w:r>
+              <w:rPr>
+                <w:b w:val="false"/>
+                <w:bCs w:val="false"/>
+                <w:color w:val="1A1A1A"/>
+                <w:sz w:val="16"/>
+                <w:szCs w:val="16"/>
+              </w:rPr>
+              <w:t xml:space="preserve">N</w:t>
+            </w:r>
+          </w:p>
+        </w:tc>
+        <w:tc>
+          <w:tcPr>
+            <w:tcW w:type="dxa" w:w="5141"/>
+            <w:tcMar>
+              <w:top w:type="dxa" w:w="40"/>
+              <w:left w:type="dxa" w:w="70"/>
+              <w:bottom w:type="dxa" w:w="40"/>
+              <w:right w:type="dxa" w:w="70"/>
+            </w:tcMar>
+          </w:tcPr>
+          <w:p>
+            <w:r>
+              <w:rPr>
+                <w:b w:val="false"/>
+                <w:bCs w:val="false"/>
+                <w:color w:val="1A1A1A"/>
+                <w:sz w:val="16"/>
+                <w:szCs w:val="16"/>
+              </w:rPr>
+              <w:t xml:space="preserve">PO price vs cost variance (Phase 2)</w:t>
+            </w:r>
+          </w:p>
+        </w:tc>
+      </w:tr>
+      <w:tr>
+        <w:tc>
+          <w:tcPr>
+            <w:tcW w:type="dxa" w:w="2522"/>
+            <w:tcMar>
+              <w:top w:type="dxa" w:w="40"/>
+              <w:left w:type="dxa" w:w="70"/>
+              <w:bottom w:type="dxa" w:w="40"/>
+              <w:right w:type="dxa" w:w="70"/>
+            </w:tcMar>
+          </w:tcPr>
+          <w:p>
+            <w:r>
+              <w:rPr>
+                <w:b w:val="false"/>
+                <w:bCs w:val="false"/>
+                <w:color w:val="1A1A1A"/>
+                <w:sz w:val="16"/>
+                <w:szCs w:val="16"/>
+              </w:rPr>
+              <w:t xml:space="preserve">DEFERRED_REVENUE_ACCOUNT</w:t>
+            </w:r>
+          </w:p>
+        </w:tc>
+        <w:tc>
+          <w:tcPr>
+            <w:tcW w:type="dxa" w:w="1358"/>
+            <w:tcMar>
+              <w:top w:type="dxa" w:w="40"/>
+              <w:left w:type="dxa" w:w="70"/>
+              <w:bottom w:type="dxa" w:w="40"/>
+              <w:right w:type="dxa" w:w="70"/>
+            </w:tcMar>
+          </w:tcPr>
+          <w:p>
+            <w:r>
+              <w:rPr>
+                <w:b w:val="false"/>
+                <w:bCs w:val="false"/>
+                <w:color w:val="1A1A1A"/>
+                <w:sz w:val="16"/>
+                <w:szCs w:val="16"/>
+              </w:rPr>
+              <w:t xml:space="preserve">VARCHAR2(500)</w:t>
+            </w:r>
+          </w:p>
+        </w:tc>
+        <w:tc>
+          <w:tcPr>
+            <w:tcW w:type="dxa" w:w="679"/>
+            <w:tcMar>
+              <w:top w:type="dxa" w:w="40"/>
+              <w:left w:type="dxa" w:w="70"/>
+              <w:bottom w:type="dxa" w:w="40"/>
+              <w:right w:type="dxa" w:w="70"/>
+            </w:tcMar>
+          </w:tcPr>
+          <w:p>
+            <w:r>
+              <w:rPr>
+                <w:b w:val="false"/>
+                <w:bCs w:val="false"/>
+                <w:color w:val="1A1A1A"/>
+                <w:sz w:val="16"/>
+                <w:szCs w:val="16"/>
+              </w:rPr>
+              <w:t xml:space="preserve">N</w:t>
+            </w:r>
+          </w:p>
+        </w:tc>
+        <w:tc>
+          <w:tcPr>
+            <w:tcW w:type="dxa" w:w="5141"/>
+            <w:tcMar>
+              <w:top w:type="dxa" w:w="40"/>
+              <w:left w:type="dxa" w:w="70"/>
+              <w:bottom w:type="dxa" w:w="40"/>
+              <w:right w:type="dxa" w:w="70"/>
+            </w:tcMar>
+          </w:tcPr>
+          <w:p>
+            <w:r>
+              <w:rPr>
+                <w:b w:val="false"/>
+                <w:bCs w:val="false"/>
+                <w:color w:val="1A1A1A"/>
+                <w:sz w:val="16"/>
+                <w:szCs w:val="16"/>
+              </w:rPr>
+              <w:t xml:space="preserve">Reserved for revenue-recognition scenarios</w:t>
+            </w:r>
+          </w:p>
+        </w:tc>
+      </w:tr>
+    </w:tbl>
+    <w:p>
+      <w:pPr>
+        <w:spacing w:after="100"/>
+      </w:pPr>
+    </w:p>
+    <w:p>
+      <w:pPr>
+        <w:pStyle w:val="Heading3"/>
+        <w:spacing w:after="60" w:before="140"/>
+      </w:pPr>
+      <w:r>
+        <w:rPr>
+          <w:b/>
+          <w:bCs/>
+          <w:color w:val="6B6B6B"/>
+          <w:sz w:val="21"/>
+          <w:szCs w:val="21"/>
+        </w:rPr>
+        <w:t xml:space="preserve">Group: Physical</w:t>
+      </w:r>
+    </w:p>
+    <w:tbl>
+      <w:tblPr>
+        <w:tblW w:type="dxa" w:w="9700"/>
+        <w:tblBorders>
+          <w:top w:val="single" w:color="auto" w:sz="4"/>
+          <w:left w:val="single" w:color="auto" w:sz="4"/>
+          <w:bottom w:val="single" w:color="auto" w:sz="4"/>
+          <w:right w:val="single" w:color="auto" w:sz="4"/>
+          <w:insideH w:val="single" w:color="auto" w:sz="4"/>
+          <w:insideV w:val="single" w:color="auto" w:sz="4"/>
+        </w:tblBorders>
+      </w:tblPr>
+      <w:tblGrid>
+        <w:gridCol w:w="2522"/>
+        <w:gridCol w:w="1358"/>
+        <w:gridCol w:w="679"/>
+        <w:gridCol w:w="5141"/>
+      </w:tblGrid>
+      <w:tr>
+        <w:trPr>
+          <w:tblHeader/>
+        </w:trPr>
+        <w:tc>
+          <w:tcPr>
+            <w:tcW w:type="dxa" w:w="2522"/>
+            <w:shd w:fill="C74634" w:val="clear"/>
+            <w:tcMar>
+              <w:top w:type="dxa" w:w="40"/>
+              <w:left w:type="dxa" w:w="70"/>
+              <w:bottom w:type="dxa" w:w="40"/>
+              <w:right w:type="dxa" w:w="70"/>
+            </w:tcMar>
+          </w:tcPr>
+          <w:p>
+            <w:r>
+              <w:rPr>
+                <w:b/>
+                <w:bCs/>
+                <w:color w:val="FFFFFF"/>
+                <w:sz w:val="16"/>
+                <w:szCs w:val="16"/>
+              </w:rPr>
+              <w:t xml:space="preserve">Column</w:t>
+            </w:r>
+          </w:p>
+        </w:tc>
+        <w:tc>
+          <w:tcPr>
+            <w:tcW w:type="dxa" w:w="1358"/>
+            <w:shd w:fill="C74634" w:val="clear"/>
+            <w:tcMar>
+              <w:top w:type="dxa" w:w="40"/>
+              <w:left w:type="dxa" w:w="70"/>
+              <w:bottom w:type="dxa" w:w="40"/>
+              <w:right w:type="dxa" w:w="70"/>
+            </w:tcMar>
+          </w:tcPr>
+          <w:p>
+            <w:r>
+              <w:rPr>
+                <w:b/>
+                <w:bCs/>
+                <w:color w:val="FFFFFF"/>
+                <w:sz w:val="16"/>
+                <w:szCs w:val="16"/>
+              </w:rPr>
+              <w:t xml:space="preserve">Type</w:t>
+            </w:r>
+          </w:p>
+        </w:tc>
+        <w:tc>
+          <w:tcPr>
+            <w:tcW w:type="dxa" w:w="679"/>
+            <w:shd w:fill="C74634" w:val="clear"/>
+            <w:tcMar>
+              <w:top w:type="dxa" w:w="40"/>
+              <w:left w:type="dxa" w:w="70"/>
+              <w:bottom w:type="dxa" w:w="40"/>
+              <w:right w:type="dxa" w:w="70"/>
+            </w:tcMar>
+          </w:tcPr>
+          <w:p>
+            <w:r>
+              <w:rPr>
+                <w:b/>
+                <w:bCs/>
+                <w:color w:val="FFFFFF"/>
+                <w:sz w:val="16"/>
+                <w:szCs w:val="16"/>
+              </w:rPr>
+              <w:t xml:space="preserve">Req</w:t>
+            </w:r>
+          </w:p>
+        </w:tc>
+        <w:tc>
+          <w:tcPr>
+            <w:tcW w:type="dxa" w:w="5141"/>
+            <w:shd w:fill="C74634" w:val="clear"/>
+            <w:tcMar>
+              <w:top w:type="dxa" w:w="40"/>
+              <w:left w:type="dxa" w:w="70"/>
+              <w:bottom w:type="dxa" w:w="40"/>
+              <w:right w:type="dxa" w:w="70"/>
+            </w:tcMar>
+          </w:tcPr>
+          <w:p>
+            <w:r>
+              <w:rPr>
+                <w:b/>
+                <w:bCs/>
+                <w:color w:val="FFFFFF"/>
+                <w:sz w:val="16"/>
+                <w:szCs w:val="16"/>
+              </w:rPr>
+              <w:t xml:space="preserve">Description</w:t>
             </w:r>
           </w:p>
         </w:tc>
@@ -18318,6 +20210,382 @@
                 <w:sz w:val="16"/>
                 <w:szCs w:val="16"/>
               </w:rPr>
+              <w:t xml:space="preserve">SALES_ACCOUNT_OVERRIDE</w:t>
+            </w:r>
+          </w:p>
+        </w:tc>
+        <w:tc>
+          <w:tcPr>
+            <w:tcW w:type="dxa" w:w="1358"/>
+            <w:tcMar>
+              <w:top w:type="dxa" w:w="40"/>
+              <w:left w:type="dxa" w:w="70"/>
+              <w:bottom w:type="dxa" w:w="40"/>
+              <w:right w:type="dxa" w:w="70"/>
+            </w:tcMar>
+          </w:tcPr>
+          <w:p>
+            <w:r>
+              <w:rPr>
+                <w:b w:val="false"/>
+                <w:bCs w:val="false"/>
+                <w:color w:val="1A1A1A"/>
+                <w:sz w:val="16"/>
+                <w:szCs w:val="16"/>
+              </w:rPr>
+              <w:t xml:space="preserve">VARCHAR2(500)</w:t>
+            </w:r>
+          </w:p>
+        </w:tc>
+        <w:tc>
+          <w:tcPr>
+            <w:tcW w:type="dxa" w:w="679"/>
+            <w:tcMar>
+              <w:top w:type="dxa" w:w="40"/>
+              <w:left w:type="dxa" w:w="70"/>
+              <w:bottom w:type="dxa" w:w="40"/>
+              <w:right w:type="dxa" w:w="70"/>
+            </w:tcMar>
+          </w:tcPr>
+          <w:p>
+            <w:r>
+              <w:rPr>
+                <w:b w:val="false"/>
+                <w:bCs w:val="false"/>
+                <w:color w:val="1A1A1A"/>
+                <w:sz w:val="16"/>
+                <w:szCs w:val="16"/>
+              </w:rPr>
+              <w:t xml:space="preserve">N</w:t>
+            </w:r>
+          </w:p>
+        </w:tc>
+        <w:tc>
+          <w:tcPr>
+            <w:tcW w:type="dxa" w:w="5141"/>
+            <w:tcMar>
+              <w:top w:type="dxa" w:w="40"/>
+              <w:left w:type="dxa" w:w="70"/>
+              <w:bottom w:type="dxa" w:w="40"/>
+              <w:right w:type="dxa" w:w="70"/>
+            </w:tcMar>
+          </w:tcPr>
+          <w:p>
+            <w:r>
+              <w:rPr>
+                <w:b w:val="false"/>
+                <w:bCs w:val="false"/>
+                <w:color w:val="1A1A1A"/>
+                <w:sz w:val="16"/>
+                <w:szCs w:val="16"/>
+              </w:rPr>
+              <w:t xml:space="preserve">Org-level revenue account override</w:t>
+            </w:r>
+          </w:p>
+        </w:tc>
+      </w:tr>
+      <w:tr>
+        <w:tc>
+          <w:tcPr>
+            <w:tcW w:type="dxa" w:w="2522"/>
+            <w:tcMar>
+              <w:top w:type="dxa" w:w="40"/>
+              <w:left w:type="dxa" w:w="70"/>
+              <w:bottom w:type="dxa" w:w="40"/>
+              <w:right w:type="dxa" w:w="70"/>
+            </w:tcMar>
+          </w:tcPr>
+          <w:p>
+            <w:r>
+              <w:rPr>
+                <w:b w:val="false"/>
+                <w:bCs w:val="false"/>
+                <w:color w:val="1A1A1A"/>
+                <w:sz w:val="16"/>
+                <w:szCs w:val="16"/>
+              </w:rPr>
+              <w:t xml:space="preserve">COGS_ACCOUNT_OVERRIDE</w:t>
+            </w:r>
+          </w:p>
+        </w:tc>
+        <w:tc>
+          <w:tcPr>
+            <w:tcW w:type="dxa" w:w="1358"/>
+            <w:tcMar>
+              <w:top w:type="dxa" w:w="40"/>
+              <w:left w:type="dxa" w:w="70"/>
+              <w:bottom w:type="dxa" w:w="40"/>
+              <w:right w:type="dxa" w:w="70"/>
+            </w:tcMar>
+          </w:tcPr>
+          <w:p>
+            <w:r>
+              <w:rPr>
+                <w:b w:val="false"/>
+                <w:bCs w:val="false"/>
+                <w:color w:val="1A1A1A"/>
+                <w:sz w:val="16"/>
+                <w:szCs w:val="16"/>
+              </w:rPr>
+              <w:t xml:space="preserve">VARCHAR2(500)</w:t>
+            </w:r>
+          </w:p>
+        </w:tc>
+        <w:tc>
+          <w:tcPr>
+            <w:tcW w:type="dxa" w:w="679"/>
+            <w:tcMar>
+              <w:top w:type="dxa" w:w="40"/>
+              <w:left w:type="dxa" w:w="70"/>
+              <w:bottom w:type="dxa" w:w="40"/>
+              <w:right w:type="dxa" w:w="70"/>
+            </w:tcMar>
+          </w:tcPr>
+          <w:p>
+            <w:r>
+              <w:rPr>
+                <w:b w:val="false"/>
+                <w:bCs w:val="false"/>
+                <w:color w:val="1A1A1A"/>
+                <w:sz w:val="16"/>
+                <w:szCs w:val="16"/>
+              </w:rPr>
+              <w:t xml:space="preserve">N</w:t>
+            </w:r>
+          </w:p>
+        </w:tc>
+        <w:tc>
+          <w:tcPr>
+            <w:tcW w:type="dxa" w:w="5141"/>
+            <w:tcMar>
+              <w:top w:type="dxa" w:w="40"/>
+              <w:left w:type="dxa" w:w="70"/>
+              <w:bottom w:type="dxa" w:w="40"/>
+              <w:right w:type="dxa" w:w="70"/>
+            </w:tcMar>
+          </w:tcPr>
+          <w:p>
+            <w:r>
+              <w:rPr>
+                <w:b w:val="false"/>
+                <w:bCs w:val="false"/>
+                <w:color w:val="1A1A1A"/>
+                <w:sz w:val="16"/>
+                <w:szCs w:val="16"/>
+              </w:rPr>
+              <w:t xml:space="preserve">Org-level COGS account override</w:t>
+            </w:r>
+          </w:p>
+        </w:tc>
+      </w:tr>
+      <w:tr>
+        <w:tc>
+          <w:tcPr>
+            <w:tcW w:type="dxa" w:w="2522"/>
+            <w:tcMar>
+              <w:top w:type="dxa" w:w="40"/>
+              <w:left w:type="dxa" w:w="70"/>
+              <w:bottom w:type="dxa" w:w="40"/>
+              <w:right w:type="dxa" w:w="70"/>
+            </w:tcMar>
+          </w:tcPr>
+          <w:p>
+            <w:r>
+              <w:rPr>
+                <w:b w:val="false"/>
+                <w:bCs w:val="false"/>
+                <w:color w:val="1A1A1A"/>
+                <w:sz w:val="16"/>
+                <w:szCs w:val="16"/>
+              </w:rPr>
+              <w:t xml:space="preserve">EXPENSE_ACCOUNT_OVERRIDE</w:t>
+            </w:r>
+          </w:p>
+        </w:tc>
+        <w:tc>
+          <w:tcPr>
+            <w:tcW w:type="dxa" w:w="1358"/>
+            <w:tcMar>
+              <w:top w:type="dxa" w:w="40"/>
+              <w:left w:type="dxa" w:w="70"/>
+              <w:bottom w:type="dxa" w:w="40"/>
+              <w:right w:type="dxa" w:w="70"/>
+            </w:tcMar>
+          </w:tcPr>
+          <w:p>
+            <w:r>
+              <w:rPr>
+                <w:b w:val="false"/>
+                <w:bCs w:val="false"/>
+                <w:color w:val="1A1A1A"/>
+                <w:sz w:val="16"/>
+                <w:szCs w:val="16"/>
+              </w:rPr>
+              <w:t xml:space="preserve">VARCHAR2(500)</w:t>
+            </w:r>
+          </w:p>
+        </w:tc>
+        <w:tc>
+          <w:tcPr>
+            <w:tcW w:type="dxa" w:w="679"/>
+            <w:tcMar>
+              <w:top w:type="dxa" w:w="40"/>
+              <w:left w:type="dxa" w:w="70"/>
+              <w:bottom w:type="dxa" w:w="40"/>
+              <w:right w:type="dxa" w:w="70"/>
+            </w:tcMar>
+          </w:tcPr>
+          <w:p>
+            <w:r>
+              <w:rPr>
+                <w:b w:val="false"/>
+                <w:bCs w:val="false"/>
+                <w:color w:val="1A1A1A"/>
+                <w:sz w:val="16"/>
+                <w:szCs w:val="16"/>
+              </w:rPr>
+              <w:t xml:space="preserve">N</w:t>
+            </w:r>
+          </w:p>
+        </w:tc>
+        <w:tc>
+          <w:tcPr>
+            <w:tcW w:type="dxa" w:w="5141"/>
+            <w:tcMar>
+              <w:top w:type="dxa" w:w="40"/>
+              <w:left w:type="dxa" w:w="70"/>
+              <w:bottom w:type="dxa" w:w="40"/>
+              <w:right w:type="dxa" w:w="70"/>
+            </w:tcMar>
+          </w:tcPr>
+          <w:p>
+            <w:r>
+              <w:rPr>
+                <w:b w:val="false"/>
+                <w:bCs w:val="false"/>
+                <w:color w:val="1A1A1A"/>
+                <w:sz w:val="16"/>
+                <w:szCs w:val="16"/>
+              </w:rPr>
+              <w:t xml:space="preserve">Org-level expense account override</w:t>
+            </w:r>
+          </w:p>
+        </w:tc>
+      </w:tr>
+      <w:tr>
+        <w:tc>
+          <w:tcPr>
+            <w:tcW w:type="dxa" w:w="2522"/>
+            <w:tcMar>
+              <w:top w:type="dxa" w:w="40"/>
+              <w:left w:type="dxa" w:w="70"/>
+              <w:bottom w:type="dxa" w:w="40"/>
+              <w:right w:type="dxa" w:w="70"/>
+            </w:tcMar>
+          </w:tcPr>
+          <w:p>
+            <w:r>
+              <w:rPr>
+                <w:b w:val="false"/>
+                <w:bCs w:val="false"/>
+                <w:color w:val="1A1A1A"/>
+                <w:sz w:val="16"/>
+                <w:szCs w:val="16"/>
+              </w:rPr>
+              <w:t xml:space="preserve">SALES_TAX_CODE_OVERRIDE / PURCHASE_TAX_CODE_OVERRIDE</w:t>
+            </w:r>
+          </w:p>
+        </w:tc>
+        <w:tc>
+          <w:tcPr>
+            <w:tcW w:type="dxa" w:w="1358"/>
+            <w:tcMar>
+              <w:top w:type="dxa" w:w="40"/>
+              <w:left w:type="dxa" w:w="70"/>
+              <w:bottom w:type="dxa" w:w="40"/>
+              <w:right w:type="dxa" w:w="70"/>
+            </w:tcMar>
+          </w:tcPr>
+          <w:p>
+            <w:r>
+              <w:rPr>
+                <w:b w:val="false"/>
+                <w:bCs w:val="false"/>
+                <w:color w:val="1A1A1A"/>
+                <w:sz w:val="16"/>
+                <w:szCs w:val="16"/>
+              </w:rPr>
+              <w:t xml:space="preserve">VARCHAR2(30)</w:t>
+            </w:r>
+          </w:p>
+        </w:tc>
+        <w:tc>
+          <w:tcPr>
+            <w:tcW w:type="dxa" w:w="679"/>
+            <w:tcMar>
+              <w:top w:type="dxa" w:w="40"/>
+              <w:left w:type="dxa" w:w="70"/>
+              <w:bottom w:type="dxa" w:w="40"/>
+              <w:right w:type="dxa" w:w="70"/>
+            </w:tcMar>
+          </w:tcPr>
+          <w:p>
+            <w:r>
+              <w:rPr>
+                <w:b w:val="false"/>
+                <w:bCs w:val="false"/>
+                <w:color w:val="1A1A1A"/>
+                <w:sz w:val="16"/>
+                <w:szCs w:val="16"/>
+              </w:rPr>
+              <w:t xml:space="preserve">N</w:t>
+            </w:r>
+          </w:p>
+        </w:tc>
+        <w:tc>
+          <w:tcPr>
+            <w:tcW w:type="dxa" w:w="5141"/>
+            <w:tcMar>
+              <w:top w:type="dxa" w:w="40"/>
+              <w:left w:type="dxa" w:w="70"/>
+              <w:bottom w:type="dxa" w:w="40"/>
+              <w:right w:type="dxa" w:w="70"/>
+            </w:tcMar>
+          </w:tcPr>
+          <w:p>
+            <w:r>
+              <w:rPr>
+                <w:b w:val="false"/>
+                <w:bCs w:val="false"/>
+                <w:color w:val="1A1A1A"/>
+                <w:sz w:val="16"/>
+                <w:szCs w:val="16"/>
+              </w:rPr>
+              <w:t xml:space="preserve">Org-level tax classification overrides</w:t>
+            </w:r>
+          </w:p>
+        </w:tc>
+      </w:tr>
+      <w:tr>
+        <w:tc>
+          <w:tcPr>
+            <w:tcW w:type="dxa" w:w="2522"/>
+            <w:tcMar>
+              <w:top w:type="dxa" w:w="40"/>
+              <w:left w:type="dxa" w:w="70"/>
+              <w:bottom w:type="dxa" w:w="40"/>
+              <w:right w:type="dxa" w:w="70"/>
+            </w:tcMar>
+          </w:tcPr>
+          <w:p>
+            <w:r>
+              <w:rPr>
+                <w:b w:val="false"/>
+                <w:bCs w:val="false"/>
+                <w:color w:val="1A1A1A"/>
+                <w:sz w:val="16"/>
+                <w:szCs w:val="16"/>
+              </w:rPr>
               <w:t xml:space="preserve">Audit columns</w:t>
             </w:r>
           </w:p>
@@ -18397,6 +20665,18 @@
       <w:pPr>
         <w:spacing w:after="100"/>
       </w:pPr>
+    </w:p>
+    <w:p>
+      <w:pPr>
+        <w:spacing w:after="100"/>
+      </w:pPr>
+      <w:r>
+        <w:rPr>
+          <w:sz w:val="20"/>
+          <w:szCs w:val="20"/>
+        </w:rPr>
+        <w:t xml:space="preserve">Account and tax resolution order everywhere in the module: document-line entry (if the user typed one) -&gt; org assignment override -&gt; item master value -&gt; organization parameter default. Tax codes reference the existing Re-ERP Tax module's code list.</w:t>
+      </w:r>
     </w:p>
     <w:p>
       <w:pPr>
@@ -31426,7 +33706,7 @@
           <w:sz w:val="15"/>
           <w:szCs w:val="15"/>
         </w:rPr>
-        <w:t xml:space="preserve">  "purchasing": { "purchasable": "Y", "listPrice": 12.50, "purchasingUom": "BOX" },</w:t>
+        <w:t xml:space="preserve">  "purchasing": { "purchasable": "Y", "listPrice": 12.50, "purchasingUom": "BOX",</w:t>
       </w:r>
     </w:p>
     <w:p>
@@ -31440,7 +33720,91 @@
           <w:sz w:val="15"/>
           <w:szCs w:val="15"/>
         </w:rPr>
-        <w:t xml:space="preserve">  "sales": { "saleable": "Y", "sellingPrice": 25.50 },</w:t>
+        <w:t xml:space="preserve">                  "purchaseTaxCode": "VAT5_IN", "invoiceMatchOption": "3_WAY" },</w:t>
+      </w:r>
+    </w:p>
+    <w:p>
+      <w:pPr>
+        <w:shd w:fill="F7F5F3" w:val="clear"/>
+        <w:spacing w:after="0"/>
+      </w:pPr>
+      <w:r>
+        <w:rPr>
+          <w:rFonts w:ascii="Consolas" w:cs="Consolas" w:eastAsia="Consolas" w:hAnsi="Consolas"/>
+          <w:sz w:val="15"/>
+          <w:szCs w:val="15"/>
+        </w:rPr>
+        <w:t xml:space="preserve">  "orderMgmt": { "saleable": "Y", "orderable": "Y", "shippable": "Y",</w:t>
+      </w:r>
+    </w:p>
+    <w:p>
+      <w:pPr>
+        <w:shd w:fill="F7F5F3" w:val="clear"/>
+        <w:spacing w:after="0"/>
+      </w:pPr>
+      <w:r>
+        <w:rPr>
+          <w:rFonts w:ascii="Consolas" w:cs="Consolas" w:eastAsia="Consolas" w:hAnsi="Consolas"/>
+          <w:sz w:val="15"/>
+          <w:szCs w:val="15"/>
+        </w:rPr>
+        <w:t xml:space="preserve">                 "invoiceable": "Y", "sellingPrice": 25.50,</w:t>
+      </w:r>
+    </w:p>
+    <w:p>
+      <w:pPr>
+        <w:shd w:fill="F7F5F3" w:val="clear"/>
+        <w:spacing w:after="0"/>
+      </w:pPr>
+      <w:r>
+        <w:rPr>
+          <w:rFonts w:ascii="Consolas" w:cs="Consolas" w:eastAsia="Consolas" w:hAnsi="Consolas"/>
+          <w:sz w:val="15"/>
+          <w:szCs w:val="15"/>
+        </w:rPr>
+        <w:t xml:space="preserve">                 "salesTaxCode": "VAT5_OUT", "taxable": "Y" },</w:t>
+      </w:r>
+    </w:p>
+    <w:p>
+      <w:pPr>
+        <w:shd w:fill="F7F5F3" w:val="clear"/>
+        <w:spacing w:after="0"/>
+      </w:pPr>
+      <w:r>
+        <w:rPr>
+          <w:rFonts w:ascii="Consolas" w:cs="Consolas" w:eastAsia="Consolas" w:hAnsi="Consolas"/>
+          <w:sz w:val="15"/>
+          <w:szCs w:val="15"/>
+        </w:rPr>
+        <w:t xml:space="preserve">  "accounting": { "salesAccount": "01-00-00-4110001-0000-000-00-000-000",</w:t>
+      </w:r>
+    </w:p>
+    <w:p>
+      <w:pPr>
+        <w:shd w:fill="F7F5F3" w:val="clear"/>
+        <w:spacing w:after="0"/>
+      </w:pPr>
+      <w:r>
+        <w:rPr>
+          <w:rFonts w:ascii="Consolas" w:cs="Consolas" w:eastAsia="Consolas" w:hAnsi="Consolas"/>
+          <w:sz w:val="15"/>
+          <w:szCs w:val="15"/>
+        </w:rPr>
+        <w:t xml:space="preserve">                  "cogsAccount":  "01-00-00-5110001-0000-000-00-000-000",</w:t>
+      </w:r>
+    </w:p>
+    <w:p>
+      <w:pPr>
+        <w:shd w:fill="F7F5F3" w:val="clear"/>
+        <w:spacing w:after="0"/>
+      </w:pPr>
+      <w:r>
+        <w:rPr>
+          <w:rFonts w:ascii="Consolas" w:cs="Consolas" w:eastAsia="Consolas" w:hAnsi="Consolas"/>
+          <w:sz w:val="15"/>
+          <w:szCs w:val="15"/>
+        </w:rPr>
+        <w:t xml:space="preserve">                  "expenseAccount": "01-00-00-6150001-0000-000-00-000-000" },</w:t>
       </w:r>
     </w:p>
     <w:p>
@@ -32787,7 +35151,7 @@
           <w:sz w:val="15"/>
           <w:szCs w:val="15"/>
         </w:rPr>
-        <w:t xml:space="preserve">| [Main | Inventory | Costing&amp;Purch | Sales&amp;Phys | Planning | Categories |  |</w:t>
+        <w:t xml:space="preserve">| [Main | Inventory | Costing&amp;Purch | Order Mgmt | Accounting | Physical |  |</w:t>
       </w:r>
     </w:p>
     <w:p>
@@ -32801,7 +35165,7 @@
           <w:sz w:val="15"/>
           <w:szCs w:val="15"/>
         </w:rPr>
-        <w:t xml:space="preserve">|  Revisions | Organizations | Attachments]                                 |</w:t>
+        <w:t xml:space="preserve">|  Planning | Categories | Revisions | Organizations | Attachments]        |</w:t>
       </w:r>
     </w:p>
     <w:p>

</xml_diff>

<commit_message>
Docs: Inventory RD v2.4 - data flow diagrams
Adds section 3.2 with four data flow diagrams: level-0 context
(users, BU/Tax/GL integrations, future PO/OM sources), the
transaction-processing pipeline (validation gates V1-V8, cost engine,
atomic writes, accounting hand-off), the inter-org transfer flow
(transfer order lifecycle, in-transit bucket, cross-cost-org
re-averaging), and the counting + period close flow.

Co-Authored-By: Claude Fable 5 <noreply@anthropic.com>
Claude-Session: https://claude.ai/code/session_018Wm1aaxafVfzTXSCsiotdW
</commit_message>
<xml_diff>
--- a/docs/design/INV_Module_Requirements_Design.docx
+++ b/docs/design/INV_Module_Requirements_Design.docx
@@ -29,7 +29,7 @@
           <w:sz w:val="22"/>
           <w:szCs w:val="22"/>
         </w:rPr>
-        <w:t xml:space="preserve">Requirements &amp; Design Document (RD) - v2.3 - September 2026</w:t>
+        <w:t xml:space="preserve">Requirements &amp; Design Document (RD) - v2.4 - September 2026</w:t>
       </w:r>
     </w:p>
     <w:p>
@@ -4405,6 +4405,988 @@
         </w:rPr>
         <w:t xml:space="preserve">All primary keys come from one sequence RR_INV_SEQ starting at 5000000001.</w:t>
       </w:r>
+    </w:p>
+    <w:p>
+      <w:pPr>
+        <w:pStyle w:val="Heading2"/>
+        <w:spacing w:after="80" w:before="200"/>
+      </w:pPr>
+      <w:r>
+        <w:rPr>
+          <w:b/>
+          <w:bCs/>
+          <w:color w:val="2A2A2A"/>
+          <w:sz w:val="24"/>
+          <w:szCs w:val="24"/>
+        </w:rPr>
+        <w:t xml:space="preserve">3.2 Data flow diagrams</w:t>
+      </w:r>
+    </w:p>
+    <w:p>
+      <w:pPr>
+        <w:pStyle w:val="Heading3"/>
+        <w:spacing w:after="60" w:before="140"/>
+      </w:pPr>
+      <w:r>
+        <w:rPr>
+          <w:b/>
+          <w:bCs/>
+          <w:color w:val="6B6B6B"/>
+          <w:sz w:val="21"/>
+          <w:szCs w:val="21"/>
+        </w:rPr>
+        <w:t xml:space="preserve">Level 0 - context</w:t>
+      </w:r>
+    </w:p>
+    <w:p>
+      <w:pPr>
+        <w:shd w:fill="F7F5F3" w:val="clear"/>
+        <w:spacing w:after="0"/>
+      </w:pPr>
+      <w:r>
+        <w:rPr>
+          <w:rFonts w:ascii="Consolas" w:cs="Consolas" w:eastAsia="Consolas" w:hAnsi="Consolas"/>
+          <w:sz w:val="15"/>
+          <w:szCs w:val="15"/>
+        </w:rPr>
+        <w:t xml:space="preserve">                 +--------------------+</w:t>
+      </w:r>
+    </w:p>
+    <w:p>
+      <w:pPr>
+        <w:shd w:fill="F7F5F3" w:val="clear"/>
+        <w:spacing w:after="0"/>
+      </w:pPr>
+      <w:r>
+        <w:rPr>
+          <w:rFonts w:ascii="Consolas" w:cs="Consolas" w:eastAsia="Consolas" w:hAnsi="Consolas"/>
+          <w:sz w:val="15"/>
+          <w:szCs w:val="15"/>
+        </w:rPr>
+        <w:t xml:space="preserve">  Users (org      |                    |  journal batches (REF5 = INV_TRANSACTIONS)</w:t>
+      </w:r>
+    </w:p>
+    <w:p>
+      <w:pPr>
+        <w:shd w:fill="F7F5F3" w:val="clear"/>
+        <w:spacing w:after="0"/>
+      </w:pPr>
+      <w:r>
+        <w:rPr>
+          <w:rFonts w:ascii="Consolas" w:cs="Consolas" w:eastAsia="Consolas" w:hAnsi="Consolas"/>
+          <w:sz w:val="15"/>
+          <w:szCs w:val="15"/>
+        </w:rPr>
+        <w:t xml:space="preserve">  access 2.1) --&gt; |     INVENTORY      | ----------------------------&gt; GL (existing)</w:t>
+      </w:r>
+    </w:p>
+    <w:p>
+      <w:pPr>
+        <w:shd w:fill="F7F5F3" w:val="clear"/>
+        <w:spacing w:after="0"/>
+      </w:pPr>
+      <w:r>
+        <w:rPr>
+          <w:rFonts w:ascii="Consolas" w:cs="Consolas" w:eastAsia="Consolas" w:hAnsi="Consolas"/>
+          <w:sz w:val="15"/>
+          <w:szCs w:val="15"/>
+        </w:rPr>
+        <w:t xml:space="preserve">                  |      MODULE        |  tax codes &lt;---- Tax module (existing)</w:t>
+      </w:r>
+    </w:p>
+    <w:p>
+      <w:pPr>
+        <w:shd w:fill="F7F5F3" w:val="clear"/>
+        <w:spacing w:after="0"/>
+      </w:pPr>
+      <w:r>
+        <w:rPr>
+          <w:rFonts w:ascii="Consolas" w:cs="Consolas" w:eastAsia="Consolas" w:hAnsi="Consolas"/>
+          <w:sz w:val="15"/>
+          <w:szCs w:val="15"/>
+        </w:rPr>
+        <w:t xml:space="preserve">  BU master ----&gt; |                    |  BU / LE   &lt;---- gl/businessunits (existing)</w:t>
+      </w:r>
+    </w:p>
+    <w:p>
+      <w:pPr>
+        <w:shd w:fill="F7F5F3" w:val="clear"/>
+        <w:spacing w:after="0"/>
+      </w:pPr>
+      <w:r>
+        <w:rPr>
+          <w:rFonts w:ascii="Consolas" w:cs="Consolas" w:eastAsia="Consolas" w:hAnsi="Consolas"/>
+          <w:sz w:val="15"/>
+          <w:szCs w:val="15"/>
+        </w:rPr>
+        <w:t xml:space="preserve">  (existing)      +--------------------+</w:t>
+      </w:r>
+    </w:p>
+    <w:p>
+      <w:pPr>
+        <w:shd w:fill="F7F5F3" w:val="clear"/>
+        <w:spacing w:after="0"/>
+      </w:pPr>
+      <w:r>
+        <w:rPr>
+          <w:rFonts w:ascii="Consolas" w:cs="Consolas" w:eastAsia="Consolas" w:hAnsi="Consolas"/>
+          <w:sz w:val="15"/>
+          <w:szCs w:val="15"/>
+        </w:rPr>
+        <w:t xml:space="preserve">                     ^            |</w:t>
+      </w:r>
+    </w:p>
+    <w:p>
+      <w:pPr>
+        <w:shd w:fill="F7F5F3" w:val="clear"/>
+        <w:spacing w:after="0"/>
+      </w:pPr>
+      <w:r>
+        <w:rPr>
+          <w:rFonts w:ascii="Consolas" w:cs="Consolas" w:eastAsia="Consolas" w:hAnsi="Consolas"/>
+          <w:sz w:val="15"/>
+          <w:szCs w:val="15"/>
+        </w:rPr>
+        <w:t xml:space="preserve">     Phase 2 PO receipts          |  on-hand, ATT, valuation, history</w:t>
+      </w:r>
+    </w:p>
+    <w:p>
+      <w:pPr>
+        <w:shd w:fill="F7F5F3" w:val="clear"/>
+        <w:spacing w:after="0"/>
+      </w:pPr>
+      <w:r>
+        <w:rPr>
+          <w:rFonts w:ascii="Consolas" w:cs="Consolas" w:eastAsia="Consolas" w:hAnsi="Consolas"/>
+          <w:sz w:val="15"/>
+          <w:szCs w:val="15"/>
+        </w:rPr>
+        <w:t xml:space="preserve">     Phase 3 SO issues            v</w:t>
+      </w:r>
+    </w:p>
+    <w:p>
+      <w:pPr>
+        <w:shd w:fill="F7F5F3" w:val="clear"/>
+        <w:spacing w:after="0"/>
+      </w:pPr>
+      <w:r>
+        <w:rPr>
+          <w:rFonts w:ascii="Consolas" w:cs="Consolas" w:eastAsia="Consolas" w:hAnsi="Consolas"/>
+          <w:sz w:val="15"/>
+          <w:szCs w:val="15"/>
+        </w:rPr>
+        <w:t xml:space="preserve">     (future sources)          Inquiry pages / reports / AI gateway</w:t>
+      </w:r>
+    </w:p>
+    <w:p>
+      <w:pPr>
+        <w:spacing w:after="100"/>
+      </w:pPr>
+    </w:p>
+    <w:p>
+      <w:pPr>
+        <w:pStyle w:val="Heading3"/>
+        <w:spacing w:after="60" w:before="140"/>
+      </w:pPr>
+      <w:r>
+        <w:rPr>
+          <w:b/>
+          <w:bCs/>
+          <w:color w:val="6B6B6B"/>
+          <w:sz w:val="21"/>
+          <w:szCs w:val="21"/>
+        </w:rPr>
+        <w:t xml:space="preserve">Level 1 - transaction processing (one database transaction)</w:t>
+      </w:r>
+    </w:p>
+    <w:p>
+      <w:pPr>
+        <w:shd w:fill="F7F5F3" w:val="clear"/>
+        <w:spacing w:after="0"/>
+      </w:pPr>
+      <w:r>
+        <w:rPr>
+          <w:rFonts w:ascii="Consolas" w:cs="Consolas" w:eastAsia="Consolas" w:hAnsi="Consolas"/>
+          <w:sz w:val="15"/>
+          <w:szCs w:val="15"/>
+        </w:rPr>
+        <w:t xml:space="preserve">  Create Transaction (UI / service / count approval / transfer execution)</w:t>
+      </w:r>
+    </w:p>
+    <w:p>
+      <w:pPr>
+        <w:shd w:fill="F7F5F3" w:val="clear"/>
+        <w:spacing w:after="0"/>
+      </w:pPr>
+      <w:r>
+        <w:rPr>
+          <w:rFonts w:ascii="Consolas" w:cs="Consolas" w:eastAsia="Consolas" w:hAnsi="Consolas"/>
+          <w:sz w:val="15"/>
+          <w:szCs w:val="15"/>
+        </w:rPr>
+        <w:t xml:space="preserve">        |</w:t>
+      </w:r>
+    </w:p>
+    <w:p>
+      <w:pPr>
+        <w:shd w:fill="F7F5F3" w:val="clear"/>
+        <w:spacing w:after="0"/>
+      </w:pPr>
+      <w:r>
+        <w:rPr>
+          <w:rFonts w:ascii="Consolas" w:cs="Consolas" w:eastAsia="Consolas" w:hAnsi="Consolas"/>
+          <w:sz w:val="15"/>
+          <w:szCs w:val="15"/>
+        </w:rPr>
+        <w:t xml:space="preserve">        v</w:t>
+      </w:r>
+    </w:p>
+    <w:p>
+      <w:pPr>
+        <w:shd w:fill="F7F5F3" w:val="clear"/>
+        <w:spacing w:after="0"/>
+      </w:pPr>
+      <w:r>
+        <w:rPr>
+          <w:rFonts w:ascii="Consolas" w:cs="Consolas" w:eastAsia="Consolas" w:hAnsi="Consolas"/>
+          <w:sz w:val="15"/>
+          <w:szCs w:val="15"/>
+        </w:rPr>
+        <w:t xml:space="preserve">  [V1 org access] -&gt; [V2 item + assignment + status] -&gt; [V3 subinv/locator</w:t>
+      </w:r>
+    </w:p>
+    <w:p>
+      <w:pPr>
+        <w:shd w:fill="F7F5F3" w:val="clear"/>
+        <w:spacing w:after="0"/>
+      </w:pPr>
+      <w:r>
+        <w:rPr>
+          <w:rFonts w:ascii="Consolas" w:cs="Consolas" w:eastAsia="Consolas" w:hAnsi="Consolas"/>
+          <w:sz w:val="15"/>
+          <w:szCs w:val="15"/>
+        </w:rPr>
+        <w:t xml:space="preserve">   + material status] -&gt; [V4 open cost period + open GL period]</w:t>
+      </w:r>
+    </w:p>
+    <w:p>
+      <w:pPr>
+        <w:shd w:fill="F7F5F3" w:val="clear"/>
+        <w:spacing w:after="0"/>
+      </w:pPr>
+      <w:r>
+        <w:rPr>
+          <w:rFonts w:ascii="Consolas" w:cs="Consolas" w:eastAsia="Consolas" w:hAnsi="Consolas"/>
+          <w:sz w:val="15"/>
+          <w:szCs w:val="15"/>
+        </w:rPr>
+        <w:t xml:space="preserve">        |</w:t>
+      </w:r>
+    </w:p>
+    <w:p>
+      <w:pPr>
+        <w:shd w:fill="F7F5F3" w:val="clear"/>
+        <w:spacing w:after="0"/>
+      </w:pPr>
+      <w:r>
+        <w:rPr>
+          <w:rFonts w:ascii="Consolas" w:cs="Consolas" w:eastAsia="Consolas" w:hAnsi="Consolas"/>
+          <w:sz w:val="15"/>
+          <w:szCs w:val="15"/>
+        </w:rPr>
+        <w:t xml:space="preserve">        v</w:t>
+      </w:r>
+    </w:p>
+    <w:p>
+      <w:pPr>
+        <w:shd w:fill="F7F5F3" w:val="clear"/>
+        <w:spacing w:after="0"/>
+      </w:pPr>
+      <w:r>
+        <w:rPr>
+          <w:rFonts w:ascii="Consolas" w:cs="Consolas" w:eastAsia="Consolas" w:hAnsi="Consolas"/>
+          <w:sz w:val="15"/>
+          <w:szCs w:val="15"/>
+        </w:rPr>
+        <w:t xml:space="preserve">  [V5 UOM conversion to primary]</w:t>
+      </w:r>
+    </w:p>
+    <w:p>
+      <w:pPr>
+        <w:shd w:fill="F7F5F3" w:val="clear"/>
+        <w:spacing w:after="0"/>
+      </w:pPr>
+      <w:r>
+        <w:rPr>
+          <w:rFonts w:ascii="Consolas" w:cs="Consolas" w:eastAsia="Consolas" w:hAnsi="Consolas"/>
+          <w:sz w:val="15"/>
+          <w:szCs w:val="15"/>
+        </w:rPr>
+        <w:t xml:space="preserve">        |</w:t>
+      </w:r>
+    </w:p>
+    <w:p>
+      <w:pPr>
+        <w:shd w:fill="F7F5F3" w:val="clear"/>
+        <w:spacing w:after="0"/>
+      </w:pPr>
+      <w:r>
+        <w:rPr>
+          <w:rFonts w:ascii="Consolas" w:cs="Consolas" w:eastAsia="Consolas" w:hAnsi="Consolas"/>
+          <w:sz w:val="15"/>
+          <w:szCs w:val="15"/>
+        </w:rPr>
+        <w:t xml:space="preserve">        v</w:t>
+      </w:r>
+    </w:p>
+    <w:p>
+      <w:pPr>
+        <w:shd w:fill="F7F5F3" w:val="clear"/>
+        <w:spacing w:after="0"/>
+      </w:pPr>
+      <w:r>
+        <w:rPr>
+          <w:rFonts w:ascii="Consolas" w:cs="Consolas" w:eastAsia="Consolas" w:hAnsi="Consolas"/>
+          <w:sz w:val="15"/>
+          <w:szCs w:val="15"/>
+        </w:rPr>
+        <w:t xml:space="preserve">  [V6 availability: on-hand - reservations &gt;= qty  (negative rule)]</w:t>
+      </w:r>
+    </w:p>
+    <w:p>
+      <w:pPr>
+        <w:shd w:fill="F7F5F3" w:val="clear"/>
+        <w:spacing w:after="0"/>
+      </w:pPr>
+      <w:r>
+        <w:rPr>
+          <w:rFonts w:ascii="Consolas" w:cs="Consolas" w:eastAsia="Consolas" w:hAnsi="Consolas"/>
+          <w:sz w:val="15"/>
+          <w:szCs w:val="15"/>
+        </w:rPr>
+        <w:t xml:space="preserve">        |</w:t>
+      </w:r>
+    </w:p>
+    <w:p>
+      <w:pPr>
+        <w:shd w:fill="F7F5F3" w:val="clear"/>
+        <w:spacing w:after="0"/>
+      </w:pPr>
+      <w:r>
+        <w:rPr>
+          <w:rFonts w:ascii="Consolas" w:cs="Consolas" w:eastAsia="Consolas" w:hAnsi="Consolas"/>
+          <w:sz w:val="15"/>
+          <w:szCs w:val="15"/>
+        </w:rPr>
+        <w:t xml:space="preserve">        v</w:t>
+      </w:r>
+    </w:p>
+    <w:p>
+      <w:pPr>
+        <w:shd w:fill="F7F5F3" w:val="clear"/>
+        <w:spacing w:after="0"/>
+      </w:pPr>
+      <w:r>
+        <w:rPr>
+          <w:rFonts w:ascii="Consolas" w:cs="Consolas" w:eastAsia="Consolas" w:hAnsi="Consolas"/>
+          <w:sz w:val="15"/>
+          <w:szCs w:val="15"/>
+        </w:rPr>
+        <w:t xml:space="preserve">  [V7 lot/serial details cover qty; expiry; serial state]</w:t>
+      </w:r>
+    </w:p>
+    <w:p>
+      <w:pPr>
+        <w:shd w:fill="F7F5F3" w:val="clear"/>
+        <w:spacing w:after="0"/>
+      </w:pPr>
+      <w:r>
+        <w:rPr>
+          <w:rFonts w:ascii="Consolas" w:cs="Consolas" w:eastAsia="Consolas" w:hAnsi="Consolas"/>
+          <w:sz w:val="15"/>
+          <w:szCs w:val="15"/>
+        </w:rPr>
+        <w:t xml:space="preserve">        |</w:t>
+      </w:r>
+    </w:p>
+    <w:p>
+      <w:pPr>
+        <w:shd w:fill="F7F5F3" w:val="clear"/>
+        <w:spacing w:after="0"/>
+      </w:pPr>
+      <w:r>
+        <w:rPr>
+          <w:rFonts w:ascii="Consolas" w:cs="Consolas" w:eastAsia="Consolas" w:hAnsi="Consolas"/>
+          <w:sz w:val="15"/>
+          <w:szCs w:val="15"/>
+        </w:rPr>
+        <w:t xml:space="preserve">        v</w:t>
+      </w:r>
+    </w:p>
+    <w:p>
+      <w:pPr>
+        <w:shd w:fill="F7F5F3" w:val="clear"/>
+        <w:spacing w:after="0"/>
+      </w:pPr>
+      <w:r>
+        <w:rPr>
+          <w:rFonts w:ascii="Consolas" w:cs="Consolas" w:eastAsia="Consolas" w:hAnsi="Consolas"/>
+          <w:sz w:val="15"/>
+          <w:szCs w:val="15"/>
+        </w:rPr>
+        <w:t xml:space="preserve">  [V8 COST ENGINE 7.4]  inflow: re-average (locked cost row)</w:t>
+      </w:r>
+    </w:p>
+    <w:p>
+      <w:pPr>
+        <w:shd w:fill="F7F5F3" w:val="clear"/>
+        <w:spacing w:after="0"/>
+      </w:pPr>
+      <w:r>
+        <w:rPr>
+          <w:rFonts w:ascii="Consolas" w:cs="Consolas" w:eastAsia="Consolas" w:hAnsi="Consolas"/>
+          <w:sz w:val="15"/>
+          <w:szCs w:val="15"/>
+        </w:rPr>
+        <w:t xml:space="preserve">        |               outflow: value at current average</w:t>
+      </w:r>
+    </w:p>
+    <w:p>
+      <w:pPr>
+        <w:shd w:fill="F7F5F3" w:val="clear"/>
+        <w:spacing w:after="0"/>
+      </w:pPr>
+      <w:r>
+        <w:rPr>
+          <w:rFonts w:ascii="Consolas" w:cs="Consolas" w:eastAsia="Consolas" w:hAnsi="Consolas"/>
+          <w:sz w:val="15"/>
+          <w:szCs w:val="15"/>
+        </w:rPr>
+        <w:t xml:space="preserve">        v</w:t>
+      </w:r>
+    </w:p>
+    <w:p>
+      <w:pPr>
+        <w:shd w:fill="F7F5F3" w:val="clear"/>
+        <w:spacing w:after="0"/>
+      </w:pPr>
+      <w:r>
+        <w:rPr>
+          <w:rFonts w:ascii="Consolas" w:cs="Consolas" w:eastAsia="Consolas" w:hAnsi="Consolas"/>
+          <w:sz w:val="15"/>
+          <w:szCs w:val="15"/>
+        </w:rPr>
+        <w:t xml:space="preserve">  WRITE (atomic):  RR_INV_TRANSACTIONS leg(s)</w:t>
+      </w:r>
+    </w:p>
+    <w:p>
+      <w:pPr>
+        <w:shd w:fill="F7F5F3" w:val="clear"/>
+        <w:spacing w:after="0"/>
+      </w:pPr>
+      <w:r>
+        <w:rPr>
+          <w:rFonts w:ascii="Consolas" w:cs="Consolas" w:eastAsia="Consolas" w:hAnsi="Consolas"/>
+          <w:sz w:val="15"/>
+          <w:szCs w:val="15"/>
+        </w:rPr>
+        <w:t xml:space="preserve">                   RR_INV_ONHAND_BALANCES  (MERGE +/- signed qty)</w:t>
+      </w:r>
+    </w:p>
+    <w:p>
+      <w:pPr>
+        <w:shd w:fill="F7F5F3" w:val="clear"/>
+        <w:spacing w:after="0"/>
+      </w:pPr>
+      <w:r>
+        <w:rPr>
+          <w:rFonts w:ascii="Consolas" w:cs="Consolas" w:eastAsia="Consolas" w:hAnsi="Consolas"/>
+          <w:sz w:val="15"/>
+          <w:szCs w:val="15"/>
+        </w:rPr>
+        <w:t xml:space="preserve">                   RR_INV_LOTS / RR_INV_SERIALS state</w:t>
+      </w:r>
+    </w:p>
+    <w:p>
+      <w:pPr>
+        <w:shd w:fill="F7F5F3" w:val="clear"/>
+        <w:spacing w:after="0"/>
+      </w:pPr>
+      <w:r>
+        <w:rPr>
+          <w:rFonts w:ascii="Consolas" w:cs="Consolas" w:eastAsia="Consolas" w:hAnsi="Consolas"/>
+          <w:sz w:val="15"/>
+          <w:szCs w:val="15"/>
+        </w:rPr>
+        <w:t xml:space="preserve">                   RR_INV_ITEM_COSTS + history   (inflows/adjustments)</w:t>
+      </w:r>
+    </w:p>
+    <w:p>
+      <w:pPr>
+        <w:shd w:fill="F7F5F3" w:val="clear"/>
+        <w:spacing w:after="0"/>
+      </w:pPr>
+      <w:r>
+        <w:rPr>
+          <w:rFonts w:ascii="Consolas" w:cs="Consolas" w:eastAsia="Consolas" w:hAnsi="Consolas"/>
+          <w:sz w:val="15"/>
+          <w:szCs w:val="15"/>
+        </w:rPr>
+        <w:t xml:space="preserve">                   RR_INV_TXN_ACCOUNTING Dr/Cr rows</w:t>
+      </w:r>
+    </w:p>
+    <w:p>
+      <w:pPr>
+        <w:shd w:fill="F7F5F3" w:val="clear"/>
+        <w:spacing w:after="0"/>
+      </w:pPr>
+      <w:r>
+        <w:rPr>
+          <w:rFonts w:ascii="Consolas" w:cs="Consolas" w:eastAsia="Consolas" w:hAnsi="Consolas"/>
+          <w:sz w:val="15"/>
+          <w:szCs w:val="15"/>
+        </w:rPr>
+        <w:t xml:space="preserve">        |</w:t>
+      </w:r>
+    </w:p>
+    <w:p>
+      <w:pPr>
+        <w:shd w:fill="F7F5F3" w:val="clear"/>
+        <w:spacing w:after="0"/>
+      </w:pPr>
+      <w:r>
+        <w:rPr>
+          <w:rFonts w:ascii="Consolas" w:cs="Consolas" w:eastAsia="Consolas" w:hAnsi="Consolas"/>
+          <w:sz w:val="15"/>
+          <w:szCs w:val="15"/>
+        </w:rPr>
+        <w:t xml:space="preserve">        v  COMMIT -&gt; response (ids, cost applied, new on-hand)</w:t>
+      </w:r>
+    </w:p>
+    <w:p>
+      <w:pPr>
+        <w:shd w:fill="F7F5F3" w:val="clear"/>
+        <w:spacing w:after="0"/>
+      </w:pPr>
+      <w:r>
+        <w:rPr>
+          <w:rFonts w:ascii="Consolas" w:cs="Consolas" w:eastAsia="Consolas" w:hAnsi="Consolas"/>
+          <w:sz w:val="15"/>
+          <w:szCs w:val="15"/>
+        </w:rPr>
+        <w:t xml:space="preserve">        |</w:t>
+      </w:r>
+    </w:p>
+    <w:p>
+      <w:pPr>
+        <w:shd w:fill="F7F5F3" w:val="clear"/>
+        <w:spacing w:after="0"/>
+      </w:pPr>
+      <w:r>
+        <w:rPr>
+          <w:rFonts w:ascii="Consolas" w:cs="Consolas" w:eastAsia="Consolas" w:hAnsi="Consolas"/>
+          <w:sz w:val="15"/>
+          <w:szCs w:val="15"/>
+        </w:rPr>
+        <w:t xml:space="preserve">        v  later: Create Accounting groups unposted Dr/Cr -&gt; one GL batch</w:t>
+      </w:r>
+    </w:p>
+    <w:p>
+      <w:pPr>
+        <w:shd w:fill="F7F5F3" w:val="clear"/>
+        <w:spacing w:after="0"/>
+      </w:pPr>
+      <w:r>
+        <w:rPr>
+          <w:rFonts w:ascii="Consolas" w:cs="Consolas" w:eastAsia="Consolas" w:hAnsi="Consolas"/>
+          <w:sz w:val="15"/>
+          <w:szCs w:val="15"/>
+        </w:rPr>
+        <w:t xml:space="preserve">                  -&gt; JE_BATCH_ID + ACCOUNTED_FLAG=Y on the transactions</w:t>
+      </w:r>
+    </w:p>
+    <w:p>
+      <w:pPr>
+        <w:spacing w:after="100"/>
+      </w:pPr>
+    </w:p>
+    <w:p>
+      <w:pPr>
+        <w:pStyle w:val="Heading3"/>
+        <w:spacing w:after="60" w:before="140"/>
+      </w:pPr>
+      <w:r>
+        <w:rPr>
+          <w:b/>
+          <w:bCs/>
+          <w:color w:val="6B6B6B"/>
+          <w:sz w:val="21"/>
+          <w:szCs w:val="21"/>
+        </w:rPr>
+        <w:t xml:space="preserve">Level 1 - inter-org transfer</w:t>
+      </w:r>
+    </w:p>
+    <w:p>
+      <w:pPr>
+        <w:shd w:fill="F7F5F3" w:val="clear"/>
+        <w:spacing w:after="0"/>
+      </w:pPr>
+      <w:r>
+        <w:rPr>
+          <w:rFonts w:ascii="Consolas" w:cs="Consolas" w:eastAsia="Consolas" w:hAnsi="Consolas"/>
+          <w:sz w:val="15"/>
+          <w:szCs w:val="15"/>
+        </w:rPr>
+        <w:t xml:space="preserve">  Transfer Order (optional document)          Ad-hoc transfer</w:t>
+      </w:r>
+    </w:p>
+    <w:p>
+      <w:pPr>
+        <w:shd w:fill="F7F5F3" w:val="clear"/>
+        <w:spacing w:after="0"/>
+      </w:pPr>
+      <w:r>
+        <w:rPr>
+          <w:rFonts w:ascii="Consolas" w:cs="Consolas" w:eastAsia="Consolas" w:hAnsi="Consolas"/>
+          <w:sz w:val="15"/>
+          <w:szCs w:val="15"/>
+        </w:rPr>
+        <w:t xml:space="preserve">   DRAFT-&gt;REQUESTED-&gt;APPROVED                      |</w:t>
+      </w:r>
+    </w:p>
+    <w:p>
+      <w:pPr>
+        <w:shd w:fill="F7F5F3" w:val="clear"/>
+        <w:spacing w:after="0"/>
+      </w:pPr>
+      <w:r>
+        <w:rPr>
+          <w:rFonts w:ascii="Consolas" w:cs="Consolas" w:eastAsia="Consolas" w:hAnsi="Consolas"/>
+          <w:sz w:val="15"/>
+          <w:szCs w:val="15"/>
+        </w:rPr>
+        <w:t xml:space="preserve">        \------------- ship ----------------------+</w:t>
+      </w:r>
+    </w:p>
+    <w:p>
+      <w:pPr>
+        <w:shd w:fill="F7F5F3" w:val="clear"/>
+        <w:spacing w:after="0"/>
+      </w:pPr>
+      <w:r>
+        <w:rPr>
+          <w:rFonts w:ascii="Consolas" w:cs="Consolas" w:eastAsia="Consolas" w:hAnsi="Consolas"/>
+          <w:sz w:val="15"/>
+          <w:szCs w:val="15"/>
+        </w:rPr>
+        <w:t xml:space="preserve">                        |</w:t>
+      </w:r>
+    </w:p>
+    <w:p>
+      <w:pPr>
+        <w:shd w:fill="F7F5F3" w:val="clear"/>
+        <w:spacing w:after="0"/>
+      </w:pPr>
+      <w:r>
+        <w:rPr>
+          <w:rFonts w:ascii="Consolas" w:cs="Consolas" w:eastAsia="Consolas" w:hAnsi="Consolas"/>
+          <w:sz w:val="15"/>
+          <w:szCs w:val="15"/>
+        </w:rPr>
+        <w:t xml:space="preserve">      SOURCE ORG: INTERORG_SHIP / DIRECT_OUT leg (-qty at source avg)</w:t>
+      </w:r>
+    </w:p>
+    <w:p>
+      <w:pPr>
+        <w:shd w:fill="F7F5F3" w:val="clear"/>
+        <w:spacing w:after="0"/>
+      </w:pPr>
+      <w:r>
+        <w:rPr>
+          <w:rFonts w:ascii="Consolas" w:cs="Consolas" w:eastAsia="Consolas" w:hAnsi="Consolas"/>
+          <w:sz w:val="15"/>
+          <w:szCs w:val="15"/>
+        </w:rPr>
+        <w:t xml:space="preserve">                        |            shipment row (SHIPPED, carries cost)</w:t>
+      </w:r>
+    </w:p>
+    <w:p>
+      <w:pPr>
+        <w:shd w:fill="F7F5F3" w:val="clear"/>
+        <w:spacing w:after="0"/>
+      </w:pPr>
+      <w:r>
+        <w:rPr>
+          <w:rFonts w:ascii="Consolas" w:cs="Consolas" w:eastAsia="Consolas" w:hAnsi="Consolas"/>
+          <w:sz w:val="15"/>
+          <w:szCs w:val="15"/>
+        </w:rPr>
+        <w:t xml:space="preserve">                        v</w:t>
+      </w:r>
+    </w:p>
+    <w:p>
+      <w:pPr>
+        <w:shd w:fill="F7F5F3" w:val="clear"/>
+        <w:spacing w:after="0"/>
+      </w:pPr>
+      <w:r>
+        <w:rPr>
+          <w:rFonts w:ascii="Consolas" w:cs="Consolas" w:eastAsia="Consolas" w:hAnsi="Consolas"/>
+          <w:sz w:val="15"/>
+          <w:szCs w:val="15"/>
+        </w:rPr>
+        <w:t xml:space="preserve">              [in-transit bucket visible in inquiry]</w:t>
+      </w:r>
+    </w:p>
+    <w:p>
+      <w:pPr>
+        <w:shd w:fill="F7F5F3" w:val="clear"/>
+        <w:spacing w:after="0"/>
+      </w:pPr>
+      <w:r>
+        <w:rPr>
+          <w:rFonts w:ascii="Consolas" w:cs="Consolas" w:eastAsia="Consolas" w:hAnsi="Consolas"/>
+          <w:sz w:val="15"/>
+          <w:szCs w:val="15"/>
+        </w:rPr>
+        <w:t xml:space="preserve">                        |</w:t>
+      </w:r>
+    </w:p>
+    <w:p>
+      <w:pPr>
+        <w:shd w:fill="F7F5F3" w:val="clear"/>
+        <w:spacing w:after="0"/>
+      </w:pPr>
+      <w:r>
+        <w:rPr>
+          <w:rFonts w:ascii="Consolas" w:cs="Consolas" w:eastAsia="Consolas" w:hAnsi="Consolas"/>
+          <w:sz w:val="15"/>
+          <w:szCs w:val="15"/>
+        </w:rPr>
+        <w:t xml:space="preserve">      DEST ORG:   receive -&gt; INTERORG_RECEIVE / DIRECT_IN leg (+qty)</w:t>
+      </w:r>
+    </w:p>
+    <w:p>
+      <w:pPr>
+        <w:shd w:fill="F7F5F3" w:val="clear"/>
+        <w:spacing w:after="0"/>
+      </w:pPr>
+      <w:r>
+        <w:rPr>
+          <w:rFonts w:ascii="Consolas" w:cs="Consolas" w:eastAsia="Consolas" w:hAnsi="Consolas"/>
+          <w:sz w:val="15"/>
+          <w:szCs w:val="15"/>
+        </w:rPr>
+        <w:t xml:space="preserve">                        |    cross cost org? -&gt; re-average at carried cost (7.6)</w:t>
+      </w:r>
+    </w:p>
+    <w:p>
+      <w:pPr>
+        <w:shd w:fill="F7F5F3" w:val="clear"/>
+        <w:spacing w:after="0"/>
+      </w:pPr>
+      <w:r>
+        <w:rPr>
+          <w:rFonts w:ascii="Consolas" w:cs="Consolas" w:eastAsia="Consolas" w:hAnsi="Consolas"/>
+          <w:sz w:val="15"/>
+          <w:szCs w:val="15"/>
+        </w:rPr>
+        <w:t xml:space="preserve">                        v</w:t>
+      </w:r>
+    </w:p>
+    <w:p>
+      <w:pPr>
+        <w:shd w:fill="F7F5F3" w:val="clear"/>
+        <w:spacing w:after="0"/>
+      </w:pPr>
+      <w:r>
+        <w:rPr>
+          <w:rFonts w:ascii="Consolas" w:cs="Consolas" w:eastAsia="Consolas" w:hAnsi="Consolas"/>
+          <w:sz w:val="15"/>
+          <w:szCs w:val="15"/>
+        </w:rPr>
+        <w:t xml:space="preserve">              shipment RECEIVED -&gt; TO lines roll up -&gt; COMPLETED</w:t>
+      </w:r>
+    </w:p>
+    <w:p>
+      <w:pPr>
+        <w:spacing w:after="100"/>
+      </w:pPr>
+    </w:p>
+    <w:p>
+      <w:pPr>
+        <w:pStyle w:val="Heading3"/>
+        <w:spacing w:after="60" w:before="140"/>
+      </w:pPr>
+      <w:r>
+        <w:rPr>
+          <w:b/>
+          <w:bCs/>
+          <w:color w:val="6B6B6B"/>
+          <w:sz w:val="21"/>
+          <w:szCs w:val="21"/>
+        </w:rPr>
+        <w:t xml:space="preserve">Level 1 - counting and period close</w:t>
+      </w:r>
+    </w:p>
+    <w:p>
+      <w:pPr>
+        <w:shd w:fill="F7F5F3" w:val="clear"/>
+        <w:spacing w:after="0"/>
+      </w:pPr>
+      <w:r>
+        <w:rPr>
+          <w:rFonts w:ascii="Consolas" w:cs="Consolas" w:eastAsia="Consolas" w:hAnsi="Consolas"/>
+          <w:sz w:val="15"/>
+          <w:szCs w:val="15"/>
+        </w:rPr>
+        <w:t xml:space="preserve">  Cycle count def / Physical inventory (user-created)</w:t>
+      </w:r>
+    </w:p>
+    <w:p>
+      <w:pPr>
+        <w:shd w:fill="F7F5F3" w:val="clear"/>
+        <w:spacing w:after="0"/>
+      </w:pPr>
+      <w:r>
+        <w:rPr>
+          <w:rFonts w:ascii="Consolas" w:cs="Consolas" w:eastAsia="Consolas" w:hAnsi="Consolas"/>
+          <w:sz w:val="15"/>
+          <w:szCs w:val="15"/>
+        </w:rPr>
+        <w:t xml:space="preserve">        |  generate entries / snapshot (PI freezes scope)</w:t>
+      </w:r>
+    </w:p>
+    <w:p>
+      <w:pPr>
+        <w:shd w:fill="F7F5F3" w:val="clear"/>
+        <w:spacing w:after="0"/>
+      </w:pPr>
+      <w:r>
+        <w:rPr>
+          <w:rFonts w:ascii="Consolas" w:cs="Consolas" w:eastAsia="Consolas" w:hAnsi="Consolas"/>
+          <w:sz w:val="15"/>
+          <w:szCs w:val="15"/>
+        </w:rPr>
+        <w:t xml:space="preserve">        v</w:t>
+      </w:r>
+    </w:p>
+    <w:p>
+      <w:pPr>
+        <w:shd w:fill="F7F5F3" w:val="clear"/>
+        <w:spacing w:after="0"/>
+      </w:pPr>
+      <w:r>
+        <w:rPr>
+          <w:rFonts w:ascii="Consolas" w:cs="Consolas" w:eastAsia="Consolas" w:hAnsi="Consolas"/>
+          <w:sz w:val="15"/>
+          <w:szCs w:val="15"/>
+        </w:rPr>
+        <w:t xml:space="preserve">  count entry -&gt; variance vs snapshot -&gt; tolerance / approval</w:t>
+      </w:r>
+    </w:p>
+    <w:p>
+      <w:pPr>
+        <w:shd w:fill="F7F5F3" w:val="clear"/>
+        <w:spacing w:after="0"/>
+      </w:pPr>
+      <w:r>
+        <w:rPr>
+          <w:rFonts w:ascii="Consolas" w:cs="Consolas" w:eastAsia="Consolas" w:hAnsi="Consolas"/>
+          <w:sz w:val="15"/>
+          <w:szCs w:val="15"/>
+        </w:rPr>
+        <w:t xml:space="preserve">        |                                   |</w:t>
+      </w:r>
+    </w:p>
+    <w:p>
+      <w:pPr>
+        <w:shd w:fill="F7F5F3" w:val="clear"/>
+        <w:spacing w:after="0"/>
+      </w:pPr>
+      <w:r>
+        <w:rPr>
+          <w:rFonts w:ascii="Consolas" w:cs="Consolas" w:eastAsia="Consolas" w:hAnsi="Consolas"/>
+          <w:sz w:val="15"/>
+          <w:szCs w:val="15"/>
+        </w:rPr>
+        <w:t xml:space="preserve">        v                                   v</w:t>
+      </w:r>
+    </w:p>
+    <w:p>
+      <w:pPr>
+        <w:shd w:fill="F7F5F3" w:val="clear"/>
+        <w:spacing w:after="0"/>
+      </w:pPr>
+      <w:r>
+        <w:rPr>
+          <w:rFonts w:ascii="Consolas" w:cs="Consolas" w:eastAsia="Consolas" w:hAnsi="Consolas"/>
+          <w:sz w:val="15"/>
+          <w:szCs w:val="15"/>
+        </w:rPr>
+        <w:t xml:space="preserve">  no variance: close entry        CYCLE_COUNT_ADJ / PHYS_INV_ADJ</w:t>
+      </w:r>
+    </w:p>
+    <w:p>
+      <w:pPr>
+        <w:shd w:fill="F7F5F3" w:val="clear"/>
+        <w:spacing w:after="0"/>
+      </w:pPr>
+      <w:r>
+        <w:rPr>
+          <w:rFonts w:ascii="Consolas" w:cs="Consolas" w:eastAsia="Consolas" w:hAnsi="Consolas"/>
+          <w:sz w:val="15"/>
+          <w:szCs w:val="15"/>
+        </w:rPr>
+        <w:t xml:space="preserve">                                  through the SAME engine pipeline above</w:t>
+      </w:r>
+    </w:p>
+    <w:p>
+      <w:pPr>
+        <w:shd w:fill="F7F5F3" w:val="clear"/>
+        <w:spacing w:after="0"/>
+      </w:pPr>
+      <w:r>
+        <w:rPr>
+          <w:rFonts w:ascii="Consolas" w:cs="Consolas" w:eastAsia="Consolas" w:hAnsi="Consolas"/>
+          <w:sz w:val="15"/>
+          <w:szCs w:val="15"/>
+        </w:rPr>
+        <w:t xml:space="preserve">  Period close (per cost org):</w:t>
+      </w:r>
+    </w:p>
+    <w:p>
+      <w:pPr>
+        <w:shd w:fill="F7F5F3" w:val="clear"/>
+        <w:spacing w:after="0"/>
+      </w:pPr>
+      <w:r>
+        <w:rPr>
+          <w:rFonts w:ascii="Consolas" w:cs="Consolas" w:eastAsia="Consolas" w:hAnsi="Consolas"/>
+          <w:sz w:val="15"/>
+          <w:szCs w:val="15"/>
+        </w:rPr>
+        <w:t xml:space="preserve">   [no unaccounted txns] + [no open PI] + [in-transit warning]</w:t>
+      </w:r>
+    </w:p>
+    <w:p>
+      <w:pPr>
+        <w:shd w:fill="F7F5F3" w:val="clear"/>
+        <w:spacing w:after="0"/>
+      </w:pPr>
+      <w:r>
+        <w:rPr>
+          <w:rFonts w:ascii="Consolas" w:cs="Consolas" w:eastAsia="Consolas" w:hAnsi="Consolas"/>
+          <w:sz w:val="15"/>
+          <w:szCs w:val="15"/>
+        </w:rPr>
+        <w:t xml:space="preserve">        -&gt; snapshot on-hand x avg into RR_INV_PERIOD_BALANCES -&gt; CLOSED</w:t>
+      </w:r>
+    </w:p>
+    <w:p>
+      <w:pPr>
+        <w:spacing w:after="100"/>
+      </w:pPr>
     </w:p>
     <w:p>
       <w:r>

</xml_diff>